<commit_message>
Ajout des diff fichiers
</commit_message>
<xml_diff>
--- a/RAPPORT DE STAGE.docx
+++ b/RAPPORT DE STAGE.docx
@@ -1,6 +1,6 @@
 
 <file path=word/document.xml><?xml version="1.0" encoding="utf-8"?>
-<w:document xmlns:wpc="http://schemas.microsoft.com/office/word/2010/wordprocessingCanvas" xmlns:cx="http://schemas.microsoft.com/office/drawing/2014/chartex" xmlns:cx1="http://schemas.microsoft.com/office/drawing/2015/9/8/chartex" xmlns:cx2="http://schemas.microsoft.com/office/drawing/2015/10/21/chartex" xmlns:cx3="http://schemas.microsoft.com/office/drawing/2016/5/9/chartex" xmlns:cx4="http://schemas.microsoft.com/office/drawing/2016/5/10/chartex" xmlns:cx5="http://schemas.microsoft.com/office/drawing/2016/5/11/chartex" xmlns:cx6="http://schemas.microsoft.com/office/drawing/2016/5/12/chartex" xmlns:cx7="http://schemas.microsoft.com/office/drawing/2016/5/13/chartex" xmlns:cx8="http://schemas.microsoft.com/office/drawing/2016/5/14/chartex" xmlns:mc="http://schemas.openxmlformats.org/markup-compatibility/2006" xmlns:aink="http://schemas.microsoft.com/office/drawing/2016/ink" xmlns:am3d="http://schemas.microsoft.com/office/drawing/2017/model3d" xmlns:o="urn:schemas-microsoft-com:office:office" xmlns:oel="http://schemas.microsoft.com/office/2019/extlst" xmlns:r="http://schemas.openxmlformats.org/officeDocument/2006/relationships" xmlns:m="http://schemas.openxmlformats.org/officeDocument/2006/math" xmlns:v="urn:schemas-microsoft-com:vml" xmlns:wp14="http://schemas.microsoft.com/office/word/2010/wordprocessingDrawing" xmlns:wp="http://schemas.openxmlformats.org/drawingml/2006/wordprocessingDrawing" xmlns:w10="urn:schemas-microsoft-com:office:word" xmlns:w="http://schemas.openxmlformats.org/wordprocessingml/2006/main" xmlns:w14="http://schemas.microsoft.com/office/word/2010/wordml" xmlns:w15="http://schemas.microsoft.com/office/word/2012/wordml" xmlns:w16cex="http://schemas.microsoft.com/office/word/2018/wordml/cex" xmlns:w16cid="http://schemas.microsoft.com/office/word/2016/wordml/cid" xmlns:w16="http://schemas.microsoft.com/office/word/2018/wordml" xmlns:w16du="http://schemas.microsoft.com/office/word/2023/wordml/word16du" xmlns:w16sdtdh="http://schemas.microsoft.com/office/word/2020/wordml/sdtdatahash" xmlns:w16sdtfl="http://schemas.microsoft.com/office/word/2024/wordml/sdtformatlock" xmlns:w16se="http://schemas.microsoft.com/office/word/2015/wordml/symex" xmlns:wpg="http://schemas.microsoft.com/office/word/2010/wordprocessingGroup" xmlns:wpi="http://schemas.microsoft.com/office/word/2010/wordprocessingInk" xmlns:wne="http://schemas.microsoft.com/office/word/2006/wordml" xmlns:wps="http://schemas.microsoft.com/office/word/2010/wordprocessingShape" mc:Ignorable="w14 w15 w16se w16cid w16 w16cex w16sdtdh w16sdtfl w16du wp14">
+<w:document xmlns:wpc="http://schemas.microsoft.com/office/word/2010/wordprocessingCanvas" xmlns:cx="http://schemas.microsoft.com/office/drawing/2014/chartex" xmlns:cx1="http://schemas.microsoft.com/office/drawing/2015/9/8/chartex" xmlns:cx2="http://schemas.microsoft.com/office/drawing/2015/10/21/chartex" xmlns:cx3="http://schemas.microsoft.com/office/drawing/2016/5/9/chartex" xmlns:cx4="http://schemas.microsoft.com/office/drawing/2016/5/10/chartex" xmlns:cx5="http://schemas.microsoft.com/office/drawing/2016/5/11/chartex" xmlns:cx6="http://schemas.microsoft.com/office/drawing/2016/5/12/chartex" xmlns:cx7="http://schemas.microsoft.com/office/drawing/2016/5/13/chartex" xmlns:cx8="http://schemas.microsoft.com/office/drawing/2016/5/14/chartex" xmlns:mc="http://schemas.openxmlformats.org/markup-compatibility/2006" xmlns:aink="http://schemas.microsoft.com/office/drawing/2016/ink" xmlns:am3d="http://schemas.microsoft.com/office/drawing/2017/model3d" xmlns:o="urn:schemas-microsoft-com:office:office" xmlns:oel="http://schemas.microsoft.com/office/2019/extlst" xmlns:r="http://schemas.openxmlformats.org/officeDocument/2006/relationships" xmlns:m="http://schemas.openxmlformats.org/officeDocument/2006/math" xmlns:v="urn:schemas-microsoft-com:vml" xmlns:wp14="http://schemas.microsoft.com/office/word/2010/wordprocessingDrawing" xmlns:wp="http://schemas.openxmlformats.org/drawingml/2006/wordprocessingDrawing" xmlns:w10="urn:schemas-microsoft-com:office:word" xmlns:w="http://schemas.openxmlformats.org/wordprocessingml/2006/main" xmlns:w14="http://schemas.microsoft.com/office/word/2010/wordml" xmlns:w15="http://schemas.microsoft.com/office/word/2012/wordml" xmlns:w16cei="http://schemas.microsoft.com/office/word/2026/wordml/cei" xmlns:w16cex="http://schemas.microsoft.com/office/word/2018/wordml/cex" xmlns:w16cid="http://schemas.microsoft.com/office/word/2016/wordml/cid" xmlns:w16="http://schemas.microsoft.com/office/word/2018/wordml" xmlns:w16du="http://schemas.microsoft.com/office/word/2023/wordml/word16du" xmlns:w16sdtdh="http://schemas.microsoft.com/office/word/2020/wordml/sdtdatahash" xmlns:w16sdtfl="http://schemas.microsoft.com/office/word/2024/wordml/sdtformatlock" xmlns:w16se="http://schemas.microsoft.com/office/word/2015/wordml/symex" xmlns:wpg="http://schemas.microsoft.com/office/word/2010/wordprocessingGroup" xmlns:wpi="http://schemas.microsoft.com/office/word/2010/wordprocessingInk" xmlns:wne="http://schemas.microsoft.com/office/word/2006/wordml" xmlns:wps="http://schemas.microsoft.com/office/word/2010/wordprocessingShape" mc:Ignorable="w14 w15 w16se w16cid w16 w16cex w16sdtdh w16sdtfl w16du wp14">
   <w:body>
     <w:p>
       <w:r>
@@ -3439,10 +3439,7 @@
         <w:t xml:space="preserve">Pour mener à bien cette mission, ce rapport s’articulera autour de trois grandes parties </w:t>
       </w:r>
       <w:r>
-        <w:t>qui sont</w:t>
-      </w:r>
-      <w:r>
-        <w:t xml:space="preserve"> </w:t>
+        <w:t xml:space="preserve">qui sont </w:t>
       </w:r>
       <w:r>
         <w:t>:</w:t>
@@ -3850,7 +3847,7 @@
           <w:lang w:eastAsia="fr-FR"/>
         </w:rPr>
         <w:drawing>
-          <wp:inline distT="0" distB="0" distL="0" distR="0" wp14:anchorId="6A86FE72" wp14:editId="7FB6B8AC">
+          <wp:inline distT="0" distB="0" distL="0" distR="0" wp14:anchorId="6A86FE72" wp14:editId="0D4D7C39">
             <wp:extent cx="5759450" cy="3237865"/>
             <wp:effectExtent l="0" t="0" r="0" b="635"/>
             <wp:docPr id="88" name="Image 88"/>
@@ -3939,7 +3936,16 @@
         <w:t xml:space="preserve">. L’entreprise offre une large gamme de services : </w:t>
       </w:r>
       <w:r>
-        <w:t xml:space="preserve">Développement Web, Applications </w:t>
+        <w:t>d</w:t>
+      </w:r>
+      <w:r>
+        <w:t xml:space="preserve">éveloppement Web, </w:t>
+      </w:r>
+      <w:r>
+        <w:t>a</w:t>
+      </w:r>
+      <w:r>
+        <w:t xml:space="preserve">pplications </w:t>
       </w:r>
       <w:r>
         <w:t>mobile</w:t>
@@ -3950,8 +3956,34 @@
       <w:r>
         <w:t xml:space="preserve">, </w:t>
       </w:r>
-      <w:r>
-        <w:t>DevOps et infrastructure, Intégration IA, Sécurité et Maintenance.</w:t>
+      <w:proofErr w:type="spellStart"/>
+      <w:r>
+        <w:t>d</w:t>
+      </w:r>
+      <w:r>
+        <w:t>evOps</w:t>
+      </w:r>
+      <w:proofErr w:type="spellEnd"/>
+      <w:r>
+        <w:t xml:space="preserve"> et infrastructure, </w:t>
+      </w:r>
+      <w:r>
+        <w:t>i</w:t>
+      </w:r>
+      <w:r>
+        <w:t>ntégration IA</w:t>
+      </w:r>
+      <w:r>
+        <w:t xml:space="preserve"> et s</w:t>
+      </w:r>
+      <w:r>
+        <w:t xml:space="preserve">écurité et </w:t>
+      </w:r>
+      <w:r>
+        <w:t>m</w:t>
+      </w:r>
+      <w:r>
+        <w:t>aintenance.</w:t>
       </w:r>
     </w:p>
     <w:p>
@@ -4134,25 +4166,25 @@
         <w:rPr>
           <w:lang w:val="fr-TG"/>
         </w:rPr>
-        <w:t>Ell</w:t>
-      </w:r>
-      <w:r>
-        <w:rPr>
-          <w:lang w:val="fr-TG"/>
-        </w:rPr>
-        <w:t>e rend le suivi de l'état d'une intervention dépendant de la disponibilité humaine</w:t>
-      </w:r>
-      <w:r>
-        <w:rPr>
-          <w:lang w:val="fr-TG"/>
-        </w:rPr>
-        <w:t xml:space="preserve"> </w:t>
-      </w:r>
-      <w:r>
-        <w:rPr>
-          <w:lang w:val="fr-TG"/>
-        </w:rPr>
-        <w:t>;</w:t>
+        <w:t>E</w:t>
+      </w:r>
+      <w:r>
+        <w:rPr>
+          <w:lang w:val="fr-TG"/>
+        </w:rPr>
+        <w:t xml:space="preserve">lle est sujette à des oublis dans l'affectation ou la notification des techniciens </w:t>
+      </w:r>
+      <w:r>
+        <w:rPr>
+          <w:lang w:val="fr-TG"/>
+        </w:rPr>
+        <w:t>à</w:t>
+      </w:r>
+      <w:r>
+        <w:rPr>
+          <w:lang w:val="fr-TG"/>
+        </w:rPr>
+        <w:t xml:space="preserve"> des clients ;</w:t>
       </w:r>
     </w:p>
     <w:p>
@@ -4175,19 +4207,7 @@
         <w:rPr>
           <w:lang w:val="fr-TG"/>
         </w:rPr>
-        <w:t xml:space="preserve">lle est sujette à des oublis dans l'affectation ou la notification des techniciens </w:t>
-      </w:r>
-      <w:r>
-        <w:rPr>
-          <w:lang w:val="fr-TG"/>
-        </w:rPr>
-        <w:t>à</w:t>
-      </w:r>
-      <w:r>
-        <w:rPr>
-          <w:lang w:val="fr-TG"/>
-        </w:rPr>
-        <w:t xml:space="preserve"> des clients ;</w:t>
+        <w:t>lle ne permet aucune analyse consolidée des performances ;</w:t>
       </w:r>
     </w:p>
     <w:p>
@@ -4210,7 +4230,13 @@
         <w:rPr>
           <w:lang w:val="fr-TG"/>
         </w:rPr>
-        <w:t>lle ne permet aucune analyse consolidée des performances ;</w:t>
+        <w:t>lle expose l'entreprise à des risques de sécurité si les échanges contiennent des informations sensibles sans contrôle d'accès formalisé</w:t>
+      </w:r>
+      <w:r>
+        <w:rPr>
+          <w:lang w:val="fr-TG"/>
+        </w:rPr>
+        <w:t xml:space="preserve"> ;</w:t>
       </w:r>
     </w:p>
     <w:p>
@@ -4229,51 +4255,17 @@
         </w:rPr>
         <w:t>E</w:t>
       </w:r>
-      <w:r>
-        <w:rPr>
-          <w:lang w:val="fr-TG"/>
-        </w:rPr>
-        <w:t>lle expose l'entreprise à des risques de sécurité si les échanges contiennent des informations sensibles sans contrôle d'accès formalisé</w:t>
-      </w:r>
-      <w:r>
-        <w:rPr>
-          <w:lang w:val="fr-TG"/>
-        </w:rPr>
-        <w:t xml:space="preserve"> ;</w:t>
-      </w:r>
-    </w:p>
-    <w:p>
-      <w:pPr>
-        <w:numPr>
-          <w:ilvl w:val="0"/>
-          <w:numId w:val="4"/>
-        </w:numPr>
-        <w:rPr>
-          <w:lang w:val="fr-TG"/>
-        </w:rPr>
-      </w:pPr>
-      <w:r>
-        <w:rPr>
-          <w:lang w:val="fr-TG"/>
-        </w:rPr>
-        <w:t>E</w:t>
-      </w:r>
       <w:proofErr w:type="spellStart"/>
       <w:r>
         <w:t>lle</w:t>
       </w:r>
       <w:proofErr w:type="spellEnd"/>
       <w:r>
-        <w:t xml:space="preserve"> manque d'adaptabilité aux contraintes de mobilité, empêchant les techniciens sur le terrain et les clients en déplacement d'accéder facilement à la plateforme via leur smartphone ou </w:t>
-      </w:r>
-      <w:proofErr w:type="gramStart"/>
-      <w:r>
-        <w:t xml:space="preserve">tablette </w:t>
+        <w:t xml:space="preserve"> manque d'adaptabilité aux contraintes de mobilité, empêchant les techniciens sur le terrain et les clients en déplacement d'accéder facilement à la plateforme via leur smartphone ou tablette</w:t>
       </w:r>
       <w:r>
         <w:t>.</w:t>
       </w:r>
-      <w:proofErr w:type="gramEnd"/>
     </w:p>
     <w:p>
       <w:pPr>
@@ -4302,7 +4294,6 @@
         <w:rPr>
           <w:lang w:val="fr-TG"/>
         </w:rPr>
-        <w:lastRenderedPageBreak/>
         <w:t>C</w:t>
       </w:r>
       <w:r>
@@ -4326,6 +4317,7 @@
         <w:rPr>
           <w:lang w:val="fr-TG"/>
         </w:rPr>
+        <w:lastRenderedPageBreak/>
         <w:t>Q</w:t>
       </w:r>
       <w:r>
@@ -4550,17 +4542,7 @@
         </w:numPr>
       </w:pPr>
       <w:r>
-        <w:lastRenderedPageBreak/>
-        <w:t>Centraliser</w:t>
-      </w:r>
-      <w:r>
-        <w:t xml:space="preserve"> la gestion des demandes d'intervention dans un seul outil, visant 100 % des tickets créés et suivis </w:t>
-      </w:r>
-      <w:r>
-        <w:t xml:space="preserve">sur la plateforme </w:t>
-      </w:r>
-      <w:r>
-        <w:t xml:space="preserve">;  </w:t>
+        <w:t xml:space="preserve">Centraliser la gestion des demandes d'intervention dans un seul outil, visant 100 % des tickets créés et suivis sur la plateforme ;  </w:t>
       </w:r>
     </w:p>
     <w:p>
@@ -4572,10 +4554,8 @@
         </w:numPr>
       </w:pPr>
       <w:r>
-        <w:t>Réduire</w:t>
-      </w:r>
-      <w:r>
-        <w:t xml:space="preserve"> le temps de prise en charge des tickets, avec un délai moyen entre création et affectation qui doit être de 30 minutes ou moins pendant les heures de bureau ;  </w:t>
+        <w:lastRenderedPageBreak/>
+        <w:t xml:space="preserve">Réduire le temps de prise en charge des tickets, avec un délai moyen entre création et affectation qui doit être de 30 minutes ou moins pendant les heures de bureau ;  </w:t>
       </w:r>
     </w:p>
     <w:p>
@@ -4587,10 +4567,7 @@
         </w:numPr>
       </w:pPr>
       <w:r>
-        <w:t>O</w:t>
-      </w:r>
-      <w:r>
-        <w:t xml:space="preserve">ffrir une visibilité en temps réel sur l'état des interventions grâce à un tableau de bord accessible aux trois types d'utilisateurs ;  </w:t>
+        <w:t xml:space="preserve">Offrir une visibilité en temps réel sur l'état des interventions grâce à un tableau de bord accessible aux trois types d'utilisateurs ;  </w:t>
       </w:r>
     </w:p>
     <w:p>
@@ -4602,10 +4579,7 @@
         </w:numPr>
       </w:pPr>
       <w:r>
-        <w:t>A</w:t>
-      </w:r>
-      <w:r>
-        <w:t xml:space="preserve">utomatiser l'information des parties prenantes, avec une notification envoyée dans un délai de 5 minutes maximum après chaque changement d'état ;  </w:t>
+        <w:t xml:space="preserve">Automatiser l'information des parties prenantes, avec une notification envoyée dans un délai de 5 minutes maximum après chaque changement d'état ;  </w:t>
       </w:r>
     </w:p>
     <w:p>
@@ -4617,10 +4591,10 @@
         </w:numPr>
       </w:pPr>
       <w:r>
-        <w:t>A</w:t>
-      </w:r>
-      <w:r>
-        <w:t xml:space="preserve">ssurer une gestion basée sur les données à l'aide de statistiques exportables (CSV/PDF) sur une période définie ;  </w:t>
+        <w:t>Permettre</w:t>
+      </w:r>
+      <w:r>
+        <w:t xml:space="preserve"> une gestion basée sur les données à l'aide de statistiques exportables (CSV/PDF) sur une période définie ;  </w:t>
       </w:r>
     </w:p>
     <w:p>
@@ -4632,10 +4606,7 @@
         </w:numPr>
       </w:pPr>
       <w:r>
-        <w:t>G</w:t>
-      </w:r>
-      <w:r>
-        <w:t>arantir la sécurité des accès et des données grâce à une authentification JWT, un contrôle d'accès rigoureux par rôle, et un chiffrement des mots de passe.</w:t>
+        <w:t>Garantir la sécurité des accès et des données grâce à une authentification JWT, un contrôle d'accès rigoureux par rôle, et un chiffrement des mots de passe.</w:t>
       </w:r>
     </w:p>
     <w:p>
@@ -4915,217 +4886,13 @@
       </w:r>
     </w:p>
     <w:p/>
-    <w:p/>
-    <w:p>
-      <w:pPr>
-        <w:tabs>
-          <w:tab w:val="left" w:pos="3721"/>
-        </w:tabs>
-      </w:pPr>
+    <w:p>
+      <w:r>
+        <w:t xml:space="preserve">Préalablement au développement de l'application, il est essentiel d'acquérir une compréhension approfondie du domaine concerné. Cette phase d'analyse, cruciale </w:t>
+      </w:r>
       <w:r>
         <w:lastRenderedPageBreak/>
-        <w:tab/>
-      </w:r>
-    </w:p>
-    <w:p/>
-    <w:p/>
-    <w:p/>
-    <w:p/>
-    <w:p/>
-    <w:p/>
-    <w:p>
-      <w:r>
-        <w:rPr>
-          <w:noProof/>
-          <w:lang w:eastAsia="fr-FR"/>
-        </w:rPr>
-        <mc:AlternateContent>
-          <mc:Choice Requires="wps">
-            <w:drawing>
-              <wp:anchor distT="0" distB="0" distL="114300" distR="114300" simplePos="0" relativeHeight="251677696" behindDoc="0" locked="0" layoutInCell="1" allowOverlap="1" wp14:anchorId="5FAAC579" wp14:editId="5BF054F8">
-                <wp:simplePos x="0" y="0"/>
-                <wp:positionH relativeFrom="margin">
-                  <wp:align>center</wp:align>
-                </wp:positionH>
-                <wp:positionV relativeFrom="paragraph">
-                  <wp:posOffset>139304</wp:posOffset>
-                </wp:positionV>
-                <wp:extent cx="4106382" cy="1390207"/>
-                <wp:effectExtent l="19050" t="19050" r="27940" b="19685"/>
-                <wp:wrapNone/>
-                <wp:docPr id="644524900" name="Parchemin : horizontal 644524900"/>
-                <wp:cNvGraphicFramePr/>
-                <a:graphic xmlns:a="http://schemas.openxmlformats.org/drawingml/2006/main">
-                  <a:graphicData uri="http://schemas.microsoft.com/office/word/2010/wordprocessingShape">
-                    <wps:wsp>
-                      <wps:cNvSpPr/>
-                      <wps:spPr>
-                        <a:xfrm>
-                          <a:off x="0" y="0"/>
-                          <a:ext cx="4106382" cy="1390207"/>
-                        </a:xfrm>
-                        <a:prstGeom prst="horizontalScroll">
-                          <a:avLst/>
-                        </a:prstGeom>
-                        <a:solidFill>
-                          <a:schemeClr val="accent2">
-                            <a:lumMod val="60000"/>
-                            <a:lumOff val="40000"/>
-                          </a:schemeClr>
-                        </a:solidFill>
-                        <a:ln w="28575">
-                          <a:solidFill>
-                            <a:schemeClr val="tx2">
-                              <a:lumMod val="50000"/>
-                            </a:schemeClr>
-                          </a:solidFill>
-                        </a:ln>
-                      </wps:spPr>
-                      <wps:style>
-                        <a:lnRef idx="2">
-                          <a:schemeClr val="accent1">
-                            <a:shade val="50000"/>
-                          </a:schemeClr>
-                        </a:lnRef>
-                        <a:fillRef idx="1">
-                          <a:schemeClr val="accent1"/>
-                        </a:fillRef>
-                        <a:effectRef idx="0">
-                          <a:schemeClr val="accent1"/>
-                        </a:effectRef>
-                        <a:fontRef idx="minor">
-                          <a:schemeClr val="lt1"/>
-                        </a:fontRef>
-                      </wps:style>
-                      <wps:txbx>
-                        <w:txbxContent>
-                          <w:p>
-                            <w:pPr>
-                              <w:pStyle w:val="Titre1"/>
-                            </w:pPr>
-                            <w:r>
-                              <w:rPr>
-                                <w:rStyle w:val="Titre1Car"/>
-                                <w:b/>
-                                <w:caps/>
-                              </w:rPr>
-                              <w:t>PARTIE</w:t>
-                            </w:r>
-                            <w:r>
-                              <w:rPr>
-                                <w:rStyle w:val="Titre2Car"/>
-                                <w:b/>
-                                <w:szCs w:val="40"/>
-                              </w:rPr>
-                              <w:t xml:space="preserve"> 1 : CAHIER DES CHARGES</w:t>
-                            </w:r>
-                          </w:p>
-                          <w:p>
-                            <w:pPr>
-                              <w:jc w:val="center"/>
-                              <w:rPr>
-                                <w:b/>
-                                <w:bCs/>
-                                <w:color w:val="000000" w:themeColor="text1"/>
-                                <w:sz w:val="32"/>
-                                <w:szCs w:val="28"/>
-                                <w14:textOutline w14:w="9525" w14:cap="rnd" w14:cmpd="sng" w14:algn="ctr">
-                                  <w14:noFill/>
-                                  <w14:prstDash w14:val="solid"/>
-                                  <w14:bevel/>
-                                </w14:textOutline>
-                              </w:rPr>
-                            </w:pPr>
-                          </w:p>
-                        </w:txbxContent>
-                      </wps:txbx>
-                      <wps:bodyPr rot="0" spcFirstLastPara="0" vertOverflow="overflow" horzOverflow="overflow" vert="horz" wrap="square" lIns="91440" tIns="0" rIns="91440" bIns="0" numCol="1" spcCol="0" rtlCol="0" fromWordArt="0" anchor="ctr" anchorCtr="0" forceAA="0" compatLnSpc="1">
-                        <a:prstTxWarp prst="textNoShape">
-                          <a:avLst/>
-                        </a:prstTxWarp>
-                        <a:noAutofit/>
-                      </wps:bodyPr>
-                    </wps:wsp>
-                  </a:graphicData>
-                </a:graphic>
-                <wp14:sizeRelH relativeFrom="margin">
-                  <wp14:pctWidth>0</wp14:pctWidth>
-                </wp14:sizeRelH>
-                <wp14:sizeRelV relativeFrom="margin">
-                  <wp14:pctHeight>0</wp14:pctHeight>
-                </wp14:sizeRelV>
-              </wp:anchor>
-            </w:drawing>
-          </mc:Choice>
-          <mc:Fallback>
-            <w:pict>
-              <v:shape w14:anchorId="5FAAC579" id="Parchemin : horizontal 644524900" o:spid="_x0000_s1038" type="#_x0000_t98" style="position:absolute;left:0;text-align:left;margin-left:0;margin-top:10.95pt;width:323.35pt;height:109.45pt;z-index:251677696;visibility:visible;mso-wrap-style:square;mso-width-percent:0;mso-height-percent:0;mso-wrap-distance-left:9pt;mso-wrap-distance-top:0;mso-wrap-distance-right:9pt;mso-wrap-distance-bottom:0;mso-position-horizontal:center;mso-position-horizontal-relative:margin;mso-position-vertical:absolute;mso-position-vertical-relative:text;mso-width-percent:0;mso-height-percent:0;mso-width-relative:margin;mso-height-relative:margin;v-text-anchor:middle" o:gfxdata="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" fillcolor="#f4b083 [1941]" strokecolor="#212934 [1615]" strokeweight="2.25pt">
-                <v:stroke joinstyle="miter"/>
-                <v:textbox inset=",0,,0">
-                  <w:txbxContent>
-                    <w:p>
-                      <w:pPr>
-                        <w:pStyle w:val="Titre1"/>
-                      </w:pPr>
-                      <w:r>
-                        <w:rPr>
-                          <w:rStyle w:val="Titre1Car"/>
-                          <w:b/>
-                          <w:caps/>
-                        </w:rPr>
-                        <w:t>PARTIE</w:t>
-                      </w:r>
-                      <w:r>
-                        <w:rPr>
-                          <w:rStyle w:val="Titre2Car"/>
-                          <w:b/>
-                          <w:szCs w:val="40"/>
-                        </w:rPr>
-                        <w:t xml:space="preserve"> 1 : CAHIER DES CHARGES</w:t>
-                      </w:r>
-                    </w:p>
-                    <w:p>
-                      <w:pPr>
-                        <w:jc w:val="center"/>
-                        <w:rPr>
-                          <w:b/>
-                          <w:bCs/>
-                          <w:color w:val="000000" w:themeColor="text1"/>
-                          <w:sz w:val="32"/>
-                          <w:szCs w:val="28"/>
-                          <w14:textOutline w14:w="9525" w14:cap="rnd" w14:cmpd="sng" w14:algn="ctr">
-                            <w14:noFill/>
-                            <w14:prstDash w14:val="solid"/>
-                            <w14:bevel/>
-                          </w14:textOutline>
-                        </w:rPr>
-                      </w:pPr>
-                    </w:p>
-                  </w:txbxContent>
-                </v:textbox>
-                <w10:wrap anchorx="margin"/>
-              </v:shape>
-            </w:pict>
-          </mc:Fallback>
-        </mc:AlternateContent>
-      </w:r>
-    </w:p>
-    <w:p/>
-    <w:p/>
-    <w:p/>
-    <w:p/>
-    <w:p/>
-    <w:p/>
-    <w:p/>
-    <w:p/>
-    <w:p/>
-    <w:p/>
-    <w:p/>
-    <w:p/>
-    <w:p>
-      <w:r>
-        <w:lastRenderedPageBreak/>
-        <w:t>Préalablement au développement de l'application, il est essentiel d'acquérir une compréhension approfondie du domaine concerné. Cette phase d'analyse, cruciale dans tout projet informatique, nous permettra d'examiner en profondeur les besoins existants afin de concevoir des solutions pertinentes.</w:t>
+        <w:t>dans tout projet informatique, nous permettra d'examiner en profondeur les besoins existants afin de concevoir des solutions pertinentes.</w:t>
       </w:r>
     </w:p>
     <w:p>
@@ -5378,7 +5145,6 @@
           <w:bCs/>
           <w:lang w:val="fr-TG"/>
         </w:rPr>
-        <w:lastRenderedPageBreak/>
         <w:t>Zendesk</w:t>
       </w:r>
       <w:proofErr w:type="spellEnd"/>
@@ -5431,6 +5197,7 @@
           <w:bCs/>
           <w:lang w:val="fr-TG"/>
         </w:rPr>
+        <w:lastRenderedPageBreak/>
         <w:t>Jira Service Management :</w:t>
       </w:r>
       <w:r>
@@ -5513,7 +5280,7 @@
 </file>
 
 <file path=word/endnotes.xml><?xml version="1.0" encoding="utf-8"?>
-<w:endnotes xmlns:wpc="http://schemas.microsoft.com/office/word/2010/wordprocessingCanvas" xmlns:cx="http://schemas.microsoft.com/office/drawing/2014/chartex" xmlns:cx1="http://schemas.microsoft.com/office/drawing/2015/9/8/chartex" xmlns:cx2="http://schemas.microsoft.com/office/drawing/2015/10/21/chartex" xmlns:cx3="http://schemas.microsoft.com/office/drawing/2016/5/9/chartex" xmlns:cx4="http://schemas.microsoft.com/office/drawing/2016/5/10/chartex" xmlns:cx5="http://schemas.microsoft.com/office/drawing/2016/5/11/chartex" xmlns:cx6="http://schemas.microsoft.com/office/drawing/2016/5/12/chartex" xmlns:cx7="http://schemas.microsoft.com/office/drawing/2016/5/13/chartex" xmlns:cx8="http://schemas.microsoft.com/office/drawing/2016/5/14/chartex" xmlns:mc="http://schemas.openxmlformats.org/markup-compatibility/2006" xmlns:aink="http://schemas.microsoft.com/office/drawing/2016/ink" xmlns:am3d="http://schemas.microsoft.com/office/drawing/2017/model3d" xmlns:o="urn:schemas-microsoft-com:office:office" xmlns:oel="http://schemas.microsoft.com/office/2019/extlst" xmlns:r="http://schemas.openxmlformats.org/officeDocument/2006/relationships" xmlns:m="http://schemas.openxmlformats.org/officeDocument/2006/math" xmlns:v="urn:schemas-microsoft-com:vml" xmlns:wp14="http://schemas.microsoft.com/office/word/2010/wordprocessingDrawing" xmlns:wp="http://schemas.openxmlformats.org/drawingml/2006/wordprocessingDrawing" xmlns:w10="urn:schemas-microsoft-com:office:word" xmlns:w="http://schemas.openxmlformats.org/wordprocessingml/2006/main" xmlns:w14="http://schemas.microsoft.com/office/word/2010/wordml" xmlns:w15="http://schemas.microsoft.com/office/word/2012/wordml" xmlns:w16cex="http://schemas.microsoft.com/office/word/2018/wordml/cex" xmlns:w16cid="http://schemas.microsoft.com/office/word/2016/wordml/cid" xmlns:w16="http://schemas.microsoft.com/office/word/2018/wordml" xmlns:w16du="http://schemas.microsoft.com/office/word/2023/wordml/word16du" xmlns:w16sdtdh="http://schemas.microsoft.com/office/word/2020/wordml/sdtdatahash" xmlns:w16sdtfl="http://schemas.microsoft.com/office/word/2024/wordml/sdtformatlock" xmlns:w16se="http://schemas.microsoft.com/office/word/2015/wordml/symex" xmlns:wpg="http://schemas.microsoft.com/office/word/2010/wordprocessingGroup" xmlns:wpi="http://schemas.microsoft.com/office/word/2010/wordprocessingInk" xmlns:wne="http://schemas.microsoft.com/office/word/2006/wordml" xmlns:wps="http://schemas.microsoft.com/office/word/2010/wordprocessingShape" mc:Ignorable="w14 w15 w16se w16cid w16 w16cex w16sdtdh w16sdtfl w16du wp14">
+<w:endnotes xmlns:wpc="http://schemas.microsoft.com/office/word/2010/wordprocessingCanvas" xmlns:cx="http://schemas.microsoft.com/office/drawing/2014/chartex" xmlns:cx1="http://schemas.microsoft.com/office/drawing/2015/9/8/chartex" xmlns:cx2="http://schemas.microsoft.com/office/drawing/2015/10/21/chartex" xmlns:cx3="http://schemas.microsoft.com/office/drawing/2016/5/9/chartex" xmlns:cx4="http://schemas.microsoft.com/office/drawing/2016/5/10/chartex" xmlns:cx5="http://schemas.microsoft.com/office/drawing/2016/5/11/chartex" xmlns:cx6="http://schemas.microsoft.com/office/drawing/2016/5/12/chartex" xmlns:cx7="http://schemas.microsoft.com/office/drawing/2016/5/13/chartex" xmlns:cx8="http://schemas.microsoft.com/office/drawing/2016/5/14/chartex" xmlns:mc="http://schemas.openxmlformats.org/markup-compatibility/2006" xmlns:aink="http://schemas.microsoft.com/office/drawing/2016/ink" xmlns:am3d="http://schemas.microsoft.com/office/drawing/2017/model3d" xmlns:o="urn:schemas-microsoft-com:office:office" xmlns:oel="http://schemas.microsoft.com/office/2019/extlst" xmlns:r="http://schemas.openxmlformats.org/officeDocument/2006/relationships" xmlns:m="http://schemas.openxmlformats.org/officeDocument/2006/math" xmlns:v="urn:schemas-microsoft-com:vml" xmlns:wp14="http://schemas.microsoft.com/office/word/2010/wordprocessingDrawing" xmlns:wp="http://schemas.openxmlformats.org/drawingml/2006/wordprocessingDrawing" xmlns:w10="urn:schemas-microsoft-com:office:word" xmlns:w="http://schemas.openxmlformats.org/wordprocessingml/2006/main" xmlns:w14="http://schemas.microsoft.com/office/word/2010/wordml" xmlns:w15="http://schemas.microsoft.com/office/word/2012/wordml" xmlns:w16cei="http://schemas.microsoft.com/office/word/2026/wordml/cei" xmlns:w16cex="http://schemas.microsoft.com/office/word/2018/wordml/cex" xmlns:w16cid="http://schemas.microsoft.com/office/word/2016/wordml/cid" xmlns:w16="http://schemas.microsoft.com/office/word/2018/wordml" xmlns:w16du="http://schemas.microsoft.com/office/word/2023/wordml/word16du" xmlns:w16sdtdh="http://schemas.microsoft.com/office/word/2020/wordml/sdtdatahash" xmlns:w16sdtfl="http://schemas.microsoft.com/office/word/2024/wordml/sdtformatlock" xmlns:w16se="http://schemas.microsoft.com/office/word/2015/wordml/symex" xmlns:wpg="http://schemas.microsoft.com/office/word/2010/wordprocessingGroup" xmlns:wpi="http://schemas.microsoft.com/office/word/2010/wordprocessingInk" xmlns:wne="http://schemas.microsoft.com/office/word/2006/wordml" xmlns:wps="http://schemas.microsoft.com/office/word/2010/wordprocessingShape" mc:Ignorable="w14 w15 w16se w16cid w16 w16cex w16sdtdh w16sdtfl w16du wp14">
   <w:endnote w:type="separator" w:id="-1">
     <w:p>
       <w:pPr>
@@ -5538,7 +5305,7 @@
 </file>
 
 <file path=word/footer1.xml><?xml version="1.0" encoding="utf-8"?>
-<w:ftr xmlns:wpc="http://schemas.microsoft.com/office/word/2010/wordprocessingCanvas" xmlns:cx="http://schemas.microsoft.com/office/drawing/2014/chartex" xmlns:cx1="http://schemas.microsoft.com/office/drawing/2015/9/8/chartex" xmlns:cx2="http://schemas.microsoft.com/office/drawing/2015/10/21/chartex" xmlns:cx3="http://schemas.microsoft.com/office/drawing/2016/5/9/chartex" xmlns:cx4="http://schemas.microsoft.com/office/drawing/2016/5/10/chartex" xmlns:cx5="http://schemas.microsoft.com/office/drawing/2016/5/11/chartex" xmlns:cx6="http://schemas.microsoft.com/office/drawing/2016/5/12/chartex" xmlns:cx7="http://schemas.microsoft.com/office/drawing/2016/5/13/chartex" xmlns:cx8="http://schemas.microsoft.com/office/drawing/2016/5/14/chartex" xmlns:mc="http://schemas.openxmlformats.org/markup-compatibility/2006" xmlns:aink="http://schemas.microsoft.com/office/drawing/2016/ink" xmlns:am3d="http://schemas.microsoft.com/office/drawing/2017/model3d" xmlns:o="urn:schemas-microsoft-com:office:office" xmlns:oel="http://schemas.microsoft.com/office/2019/extlst" xmlns:r="http://schemas.openxmlformats.org/officeDocument/2006/relationships" xmlns:m="http://schemas.openxmlformats.org/officeDocument/2006/math" xmlns:v="urn:schemas-microsoft-com:vml" xmlns:wp14="http://schemas.microsoft.com/office/word/2010/wordprocessingDrawing" xmlns:wp="http://schemas.openxmlformats.org/drawingml/2006/wordprocessingDrawing" xmlns:w10="urn:schemas-microsoft-com:office:word" xmlns:w="http://schemas.openxmlformats.org/wordprocessingml/2006/main" xmlns:w14="http://schemas.microsoft.com/office/word/2010/wordml" xmlns:w15="http://schemas.microsoft.com/office/word/2012/wordml" xmlns:w16cex="http://schemas.microsoft.com/office/word/2018/wordml/cex" xmlns:w16cid="http://schemas.microsoft.com/office/word/2016/wordml/cid" xmlns:w16="http://schemas.microsoft.com/office/word/2018/wordml" xmlns:w16du="http://schemas.microsoft.com/office/word/2023/wordml/word16du" xmlns:w16sdtdh="http://schemas.microsoft.com/office/word/2020/wordml/sdtdatahash" xmlns:w16sdtfl="http://schemas.microsoft.com/office/word/2024/wordml/sdtformatlock" xmlns:w16se="http://schemas.microsoft.com/office/word/2015/wordml/symex" xmlns:wpg="http://schemas.microsoft.com/office/word/2010/wordprocessingGroup" xmlns:wpi="http://schemas.microsoft.com/office/word/2010/wordprocessingInk" xmlns:wne="http://schemas.microsoft.com/office/word/2006/wordml" xmlns:wps="http://schemas.microsoft.com/office/word/2010/wordprocessingShape" mc:Ignorable="w14 w15 w16se w16cid w16 w16cex w16sdtdh w16sdtfl w16du wp14">
+<w:ftr xmlns:wpc="http://schemas.microsoft.com/office/word/2010/wordprocessingCanvas" xmlns:cx="http://schemas.microsoft.com/office/drawing/2014/chartex" xmlns:cx1="http://schemas.microsoft.com/office/drawing/2015/9/8/chartex" xmlns:cx2="http://schemas.microsoft.com/office/drawing/2015/10/21/chartex" xmlns:cx3="http://schemas.microsoft.com/office/drawing/2016/5/9/chartex" xmlns:cx4="http://schemas.microsoft.com/office/drawing/2016/5/10/chartex" xmlns:cx5="http://schemas.microsoft.com/office/drawing/2016/5/11/chartex" xmlns:cx6="http://schemas.microsoft.com/office/drawing/2016/5/12/chartex" xmlns:cx7="http://schemas.microsoft.com/office/drawing/2016/5/13/chartex" xmlns:cx8="http://schemas.microsoft.com/office/drawing/2016/5/14/chartex" xmlns:mc="http://schemas.openxmlformats.org/markup-compatibility/2006" xmlns:aink="http://schemas.microsoft.com/office/drawing/2016/ink" xmlns:am3d="http://schemas.microsoft.com/office/drawing/2017/model3d" xmlns:o="urn:schemas-microsoft-com:office:office" xmlns:oel="http://schemas.microsoft.com/office/2019/extlst" xmlns:r="http://schemas.openxmlformats.org/officeDocument/2006/relationships" xmlns:m="http://schemas.openxmlformats.org/officeDocument/2006/math" xmlns:v="urn:schemas-microsoft-com:vml" xmlns:wp14="http://schemas.microsoft.com/office/word/2010/wordprocessingDrawing" xmlns:wp="http://schemas.openxmlformats.org/drawingml/2006/wordprocessingDrawing" xmlns:w10="urn:schemas-microsoft-com:office:word" xmlns:w="http://schemas.openxmlformats.org/wordprocessingml/2006/main" xmlns:w14="http://schemas.microsoft.com/office/word/2010/wordml" xmlns:w15="http://schemas.microsoft.com/office/word/2012/wordml" xmlns:w16cei="http://schemas.microsoft.com/office/word/2026/wordml/cei" xmlns:w16cex="http://schemas.microsoft.com/office/word/2018/wordml/cex" xmlns:w16cid="http://schemas.microsoft.com/office/word/2016/wordml/cid" xmlns:w16="http://schemas.microsoft.com/office/word/2018/wordml" xmlns:w16du="http://schemas.microsoft.com/office/word/2023/wordml/word16du" xmlns:w16sdtdh="http://schemas.microsoft.com/office/word/2020/wordml/sdtdatahash" xmlns:w16sdtfl="http://schemas.microsoft.com/office/word/2024/wordml/sdtformatlock" xmlns:w16se="http://schemas.microsoft.com/office/word/2015/wordml/symex" xmlns:wpg="http://schemas.microsoft.com/office/word/2010/wordprocessingGroup" xmlns:wpi="http://schemas.microsoft.com/office/word/2010/wordprocessingInk" xmlns:wne="http://schemas.microsoft.com/office/word/2006/wordml" xmlns:wps="http://schemas.microsoft.com/office/word/2010/wordprocessingShape" mc:Ignorable="w14 w15 w16se w16cid w16 w16cex w16sdtdh w16sdtfl w16du wp14">
   <w:sdt>
     <w:sdtPr>
       <w:id w:val="-2000722699"/>
@@ -5580,7 +5347,7 @@
 </file>
 
 <file path=word/footer2.xml><?xml version="1.0" encoding="utf-8"?>
-<w:ftr xmlns:wpc="http://schemas.microsoft.com/office/word/2010/wordprocessingCanvas" xmlns:cx="http://schemas.microsoft.com/office/drawing/2014/chartex" xmlns:cx1="http://schemas.microsoft.com/office/drawing/2015/9/8/chartex" xmlns:cx2="http://schemas.microsoft.com/office/drawing/2015/10/21/chartex" xmlns:cx3="http://schemas.microsoft.com/office/drawing/2016/5/9/chartex" xmlns:cx4="http://schemas.microsoft.com/office/drawing/2016/5/10/chartex" xmlns:cx5="http://schemas.microsoft.com/office/drawing/2016/5/11/chartex" xmlns:cx6="http://schemas.microsoft.com/office/drawing/2016/5/12/chartex" xmlns:cx7="http://schemas.microsoft.com/office/drawing/2016/5/13/chartex" xmlns:cx8="http://schemas.microsoft.com/office/drawing/2016/5/14/chartex" xmlns:mc="http://schemas.openxmlformats.org/markup-compatibility/2006" xmlns:aink="http://schemas.microsoft.com/office/drawing/2016/ink" xmlns:am3d="http://schemas.microsoft.com/office/drawing/2017/model3d" xmlns:o="urn:schemas-microsoft-com:office:office" xmlns:oel="http://schemas.microsoft.com/office/2019/extlst" xmlns:r="http://schemas.openxmlformats.org/officeDocument/2006/relationships" xmlns:m="http://schemas.openxmlformats.org/officeDocument/2006/math" xmlns:v="urn:schemas-microsoft-com:vml" xmlns:wp14="http://schemas.microsoft.com/office/word/2010/wordprocessingDrawing" xmlns:wp="http://schemas.openxmlformats.org/drawingml/2006/wordprocessingDrawing" xmlns:w10="urn:schemas-microsoft-com:office:word" xmlns:w="http://schemas.openxmlformats.org/wordprocessingml/2006/main" xmlns:w14="http://schemas.microsoft.com/office/word/2010/wordml" xmlns:w15="http://schemas.microsoft.com/office/word/2012/wordml" xmlns:w16cex="http://schemas.microsoft.com/office/word/2018/wordml/cex" xmlns:w16cid="http://schemas.microsoft.com/office/word/2016/wordml/cid" xmlns:w16="http://schemas.microsoft.com/office/word/2018/wordml" xmlns:w16du="http://schemas.microsoft.com/office/word/2023/wordml/word16du" xmlns:w16sdtdh="http://schemas.microsoft.com/office/word/2020/wordml/sdtdatahash" xmlns:w16sdtfl="http://schemas.microsoft.com/office/word/2024/wordml/sdtformatlock" xmlns:w16se="http://schemas.microsoft.com/office/word/2015/wordml/symex" xmlns:wpg="http://schemas.microsoft.com/office/word/2010/wordprocessingGroup" xmlns:wpi="http://schemas.microsoft.com/office/word/2010/wordprocessingInk" xmlns:wne="http://schemas.microsoft.com/office/word/2006/wordml" xmlns:wps="http://schemas.microsoft.com/office/word/2010/wordprocessingShape" mc:Ignorable="w14 w15 w16se w16cid w16 w16cex w16sdtdh w16sdtfl w16du wp14">
+<w:ftr xmlns:wpc="http://schemas.microsoft.com/office/word/2010/wordprocessingCanvas" xmlns:cx="http://schemas.microsoft.com/office/drawing/2014/chartex" xmlns:cx1="http://schemas.microsoft.com/office/drawing/2015/9/8/chartex" xmlns:cx2="http://schemas.microsoft.com/office/drawing/2015/10/21/chartex" xmlns:cx3="http://schemas.microsoft.com/office/drawing/2016/5/9/chartex" xmlns:cx4="http://schemas.microsoft.com/office/drawing/2016/5/10/chartex" xmlns:cx5="http://schemas.microsoft.com/office/drawing/2016/5/11/chartex" xmlns:cx6="http://schemas.microsoft.com/office/drawing/2016/5/12/chartex" xmlns:cx7="http://schemas.microsoft.com/office/drawing/2016/5/13/chartex" xmlns:cx8="http://schemas.microsoft.com/office/drawing/2016/5/14/chartex" xmlns:mc="http://schemas.openxmlformats.org/markup-compatibility/2006" xmlns:aink="http://schemas.microsoft.com/office/drawing/2016/ink" xmlns:am3d="http://schemas.microsoft.com/office/drawing/2017/model3d" xmlns:o="urn:schemas-microsoft-com:office:office" xmlns:oel="http://schemas.microsoft.com/office/2019/extlst" xmlns:r="http://schemas.openxmlformats.org/officeDocument/2006/relationships" xmlns:m="http://schemas.openxmlformats.org/officeDocument/2006/math" xmlns:v="urn:schemas-microsoft-com:vml" xmlns:wp14="http://schemas.microsoft.com/office/word/2010/wordprocessingDrawing" xmlns:wp="http://schemas.openxmlformats.org/drawingml/2006/wordprocessingDrawing" xmlns:w10="urn:schemas-microsoft-com:office:word" xmlns:w="http://schemas.openxmlformats.org/wordprocessingml/2006/main" xmlns:w14="http://schemas.microsoft.com/office/word/2010/wordml" xmlns:w15="http://schemas.microsoft.com/office/word/2012/wordml" xmlns:w16cei="http://schemas.microsoft.com/office/word/2026/wordml/cei" xmlns:w16cex="http://schemas.microsoft.com/office/word/2018/wordml/cex" xmlns:w16cid="http://schemas.microsoft.com/office/word/2016/wordml/cid" xmlns:w16="http://schemas.microsoft.com/office/word/2018/wordml" xmlns:w16du="http://schemas.microsoft.com/office/word/2023/wordml/word16du" xmlns:w16sdtdh="http://schemas.microsoft.com/office/word/2020/wordml/sdtdatahash" xmlns:w16sdtfl="http://schemas.microsoft.com/office/word/2024/wordml/sdtformatlock" xmlns:w16se="http://schemas.microsoft.com/office/word/2015/wordml/symex" xmlns:wpg="http://schemas.microsoft.com/office/word/2010/wordprocessingGroup" xmlns:wpi="http://schemas.microsoft.com/office/word/2010/wordprocessingInk" xmlns:wne="http://schemas.microsoft.com/office/word/2006/wordml" xmlns:wps="http://schemas.microsoft.com/office/word/2010/wordprocessingShape" mc:Ignorable="w14 w15 w16se w16cid w16 w16cex w16sdtdh w16sdtfl w16du wp14">
   <w:p>
     <w:pPr>
       <w:pStyle w:val="Pieddepage"/>
@@ -5595,7 +5362,7 @@
 </file>
 
 <file path=word/footnotes.xml><?xml version="1.0" encoding="utf-8"?>
-<w:footnotes xmlns:wpc="http://schemas.microsoft.com/office/word/2010/wordprocessingCanvas" xmlns:cx="http://schemas.microsoft.com/office/drawing/2014/chartex" xmlns:cx1="http://schemas.microsoft.com/office/drawing/2015/9/8/chartex" xmlns:cx2="http://schemas.microsoft.com/office/drawing/2015/10/21/chartex" xmlns:cx3="http://schemas.microsoft.com/office/drawing/2016/5/9/chartex" xmlns:cx4="http://schemas.microsoft.com/office/drawing/2016/5/10/chartex" xmlns:cx5="http://schemas.microsoft.com/office/drawing/2016/5/11/chartex" xmlns:cx6="http://schemas.microsoft.com/office/drawing/2016/5/12/chartex" xmlns:cx7="http://schemas.microsoft.com/office/drawing/2016/5/13/chartex" xmlns:cx8="http://schemas.microsoft.com/office/drawing/2016/5/14/chartex" xmlns:mc="http://schemas.openxmlformats.org/markup-compatibility/2006" xmlns:aink="http://schemas.microsoft.com/office/drawing/2016/ink" xmlns:am3d="http://schemas.microsoft.com/office/drawing/2017/model3d" xmlns:o="urn:schemas-microsoft-com:office:office" xmlns:oel="http://schemas.microsoft.com/office/2019/extlst" xmlns:r="http://schemas.openxmlformats.org/officeDocument/2006/relationships" xmlns:m="http://schemas.openxmlformats.org/officeDocument/2006/math" xmlns:v="urn:schemas-microsoft-com:vml" xmlns:wp14="http://schemas.microsoft.com/office/word/2010/wordprocessingDrawing" xmlns:wp="http://schemas.openxmlformats.org/drawingml/2006/wordprocessingDrawing" xmlns:w10="urn:schemas-microsoft-com:office:word" xmlns:w="http://schemas.openxmlformats.org/wordprocessingml/2006/main" xmlns:w14="http://schemas.microsoft.com/office/word/2010/wordml" xmlns:w15="http://schemas.microsoft.com/office/word/2012/wordml" xmlns:w16cex="http://schemas.microsoft.com/office/word/2018/wordml/cex" xmlns:w16cid="http://schemas.microsoft.com/office/word/2016/wordml/cid" xmlns:w16="http://schemas.microsoft.com/office/word/2018/wordml" xmlns:w16du="http://schemas.microsoft.com/office/word/2023/wordml/word16du" xmlns:w16sdtdh="http://schemas.microsoft.com/office/word/2020/wordml/sdtdatahash" xmlns:w16sdtfl="http://schemas.microsoft.com/office/word/2024/wordml/sdtformatlock" xmlns:w16se="http://schemas.microsoft.com/office/word/2015/wordml/symex" xmlns:wpg="http://schemas.microsoft.com/office/word/2010/wordprocessingGroup" xmlns:wpi="http://schemas.microsoft.com/office/word/2010/wordprocessingInk" xmlns:wne="http://schemas.microsoft.com/office/word/2006/wordml" xmlns:wps="http://schemas.microsoft.com/office/word/2010/wordprocessingShape" mc:Ignorable="w14 w15 w16se w16cid w16 w16cex w16sdtdh w16sdtfl w16du wp14">
+<w:footnotes xmlns:wpc="http://schemas.microsoft.com/office/word/2010/wordprocessingCanvas" xmlns:cx="http://schemas.microsoft.com/office/drawing/2014/chartex" xmlns:cx1="http://schemas.microsoft.com/office/drawing/2015/9/8/chartex" xmlns:cx2="http://schemas.microsoft.com/office/drawing/2015/10/21/chartex" xmlns:cx3="http://schemas.microsoft.com/office/drawing/2016/5/9/chartex" xmlns:cx4="http://schemas.microsoft.com/office/drawing/2016/5/10/chartex" xmlns:cx5="http://schemas.microsoft.com/office/drawing/2016/5/11/chartex" xmlns:cx6="http://schemas.microsoft.com/office/drawing/2016/5/12/chartex" xmlns:cx7="http://schemas.microsoft.com/office/drawing/2016/5/13/chartex" xmlns:cx8="http://schemas.microsoft.com/office/drawing/2016/5/14/chartex" xmlns:mc="http://schemas.openxmlformats.org/markup-compatibility/2006" xmlns:aink="http://schemas.microsoft.com/office/drawing/2016/ink" xmlns:am3d="http://schemas.microsoft.com/office/drawing/2017/model3d" xmlns:o="urn:schemas-microsoft-com:office:office" xmlns:oel="http://schemas.microsoft.com/office/2019/extlst" xmlns:r="http://schemas.openxmlformats.org/officeDocument/2006/relationships" xmlns:m="http://schemas.openxmlformats.org/officeDocument/2006/math" xmlns:v="urn:schemas-microsoft-com:vml" xmlns:wp14="http://schemas.microsoft.com/office/word/2010/wordprocessingDrawing" xmlns:wp="http://schemas.openxmlformats.org/drawingml/2006/wordprocessingDrawing" xmlns:w10="urn:schemas-microsoft-com:office:word" xmlns:w="http://schemas.openxmlformats.org/wordprocessingml/2006/main" xmlns:w14="http://schemas.microsoft.com/office/word/2010/wordml" xmlns:w15="http://schemas.microsoft.com/office/word/2012/wordml" xmlns:w16cei="http://schemas.microsoft.com/office/word/2026/wordml/cei" xmlns:w16cex="http://schemas.microsoft.com/office/word/2018/wordml/cex" xmlns:w16cid="http://schemas.microsoft.com/office/word/2016/wordml/cid" xmlns:w16="http://schemas.microsoft.com/office/word/2018/wordml" xmlns:w16du="http://schemas.microsoft.com/office/word/2023/wordml/word16du" xmlns:w16sdtdh="http://schemas.microsoft.com/office/word/2020/wordml/sdtdatahash" xmlns:w16sdtfl="http://schemas.microsoft.com/office/word/2024/wordml/sdtformatlock" xmlns:w16se="http://schemas.microsoft.com/office/word/2015/wordml/symex" xmlns:wpg="http://schemas.microsoft.com/office/word/2010/wordprocessingGroup" xmlns:wpi="http://schemas.microsoft.com/office/word/2010/wordprocessingInk" xmlns:wne="http://schemas.microsoft.com/office/word/2006/wordml" xmlns:wps="http://schemas.microsoft.com/office/word/2010/wordprocessingShape" mc:Ignorable="w14 w15 w16se w16cid w16 w16cex w16sdtdh w16sdtfl w16du wp14">
   <w:footnote w:type="separator" w:id="-1">
     <w:p>
       <w:pPr>
@@ -5620,7 +5387,7 @@
 </file>
 
 <file path=word/header1.xml><?xml version="1.0" encoding="utf-8"?>
-<w:hdr xmlns:wpc="http://schemas.microsoft.com/office/word/2010/wordprocessingCanvas" xmlns:cx="http://schemas.microsoft.com/office/drawing/2014/chartex" xmlns:cx1="http://schemas.microsoft.com/office/drawing/2015/9/8/chartex" xmlns:cx2="http://schemas.microsoft.com/office/drawing/2015/10/21/chartex" xmlns:cx3="http://schemas.microsoft.com/office/drawing/2016/5/9/chartex" xmlns:cx4="http://schemas.microsoft.com/office/drawing/2016/5/10/chartex" xmlns:cx5="http://schemas.microsoft.com/office/drawing/2016/5/11/chartex" xmlns:cx6="http://schemas.microsoft.com/office/drawing/2016/5/12/chartex" xmlns:cx7="http://schemas.microsoft.com/office/drawing/2016/5/13/chartex" xmlns:cx8="http://schemas.microsoft.com/office/drawing/2016/5/14/chartex" xmlns:mc="http://schemas.openxmlformats.org/markup-compatibility/2006" xmlns:aink="http://schemas.microsoft.com/office/drawing/2016/ink" xmlns:am3d="http://schemas.microsoft.com/office/drawing/2017/model3d" xmlns:o="urn:schemas-microsoft-com:office:office" xmlns:oel="http://schemas.microsoft.com/office/2019/extlst" xmlns:r="http://schemas.openxmlformats.org/officeDocument/2006/relationships" xmlns:m="http://schemas.openxmlformats.org/officeDocument/2006/math" xmlns:v="urn:schemas-microsoft-com:vml" xmlns:wp14="http://schemas.microsoft.com/office/word/2010/wordprocessingDrawing" xmlns:wp="http://schemas.openxmlformats.org/drawingml/2006/wordprocessingDrawing" xmlns:w10="urn:schemas-microsoft-com:office:word" xmlns:w="http://schemas.openxmlformats.org/wordprocessingml/2006/main" xmlns:w14="http://schemas.microsoft.com/office/word/2010/wordml" xmlns:w15="http://schemas.microsoft.com/office/word/2012/wordml" xmlns:w16cex="http://schemas.microsoft.com/office/word/2018/wordml/cex" xmlns:w16cid="http://schemas.microsoft.com/office/word/2016/wordml/cid" xmlns:w16="http://schemas.microsoft.com/office/word/2018/wordml" xmlns:w16du="http://schemas.microsoft.com/office/word/2023/wordml/word16du" xmlns:w16sdtdh="http://schemas.microsoft.com/office/word/2020/wordml/sdtdatahash" xmlns:w16sdtfl="http://schemas.microsoft.com/office/word/2024/wordml/sdtformatlock" xmlns:w16se="http://schemas.microsoft.com/office/word/2015/wordml/symex" xmlns:wpg="http://schemas.microsoft.com/office/word/2010/wordprocessingGroup" xmlns:wpi="http://schemas.microsoft.com/office/word/2010/wordprocessingInk" xmlns:wne="http://schemas.microsoft.com/office/word/2006/wordml" xmlns:wps="http://schemas.microsoft.com/office/word/2010/wordprocessingShape" mc:Ignorable="w14 w15 w16se w16cid w16 w16cex w16sdtdh w16sdtfl w16du wp14">
+<w:hdr xmlns:wpc="http://schemas.microsoft.com/office/word/2010/wordprocessingCanvas" xmlns:cx="http://schemas.microsoft.com/office/drawing/2014/chartex" xmlns:cx1="http://schemas.microsoft.com/office/drawing/2015/9/8/chartex" xmlns:cx2="http://schemas.microsoft.com/office/drawing/2015/10/21/chartex" xmlns:cx3="http://schemas.microsoft.com/office/drawing/2016/5/9/chartex" xmlns:cx4="http://schemas.microsoft.com/office/drawing/2016/5/10/chartex" xmlns:cx5="http://schemas.microsoft.com/office/drawing/2016/5/11/chartex" xmlns:cx6="http://schemas.microsoft.com/office/drawing/2016/5/12/chartex" xmlns:cx7="http://schemas.microsoft.com/office/drawing/2016/5/13/chartex" xmlns:cx8="http://schemas.microsoft.com/office/drawing/2016/5/14/chartex" xmlns:mc="http://schemas.openxmlformats.org/markup-compatibility/2006" xmlns:aink="http://schemas.microsoft.com/office/drawing/2016/ink" xmlns:am3d="http://schemas.microsoft.com/office/drawing/2017/model3d" xmlns:o="urn:schemas-microsoft-com:office:office" xmlns:oel="http://schemas.microsoft.com/office/2019/extlst" xmlns:r="http://schemas.openxmlformats.org/officeDocument/2006/relationships" xmlns:m="http://schemas.openxmlformats.org/officeDocument/2006/math" xmlns:v="urn:schemas-microsoft-com:vml" xmlns:wp14="http://schemas.microsoft.com/office/word/2010/wordprocessingDrawing" xmlns:wp="http://schemas.openxmlformats.org/drawingml/2006/wordprocessingDrawing" xmlns:w10="urn:schemas-microsoft-com:office:word" xmlns:w="http://schemas.openxmlformats.org/wordprocessingml/2006/main" xmlns:w14="http://schemas.microsoft.com/office/word/2010/wordml" xmlns:w15="http://schemas.microsoft.com/office/word/2012/wordml" xmlns:w16cei="http://schemas.microsoft.com/office/word/2026/wordml/cei" xmlns:w16cex="http://schemas.microsoft.com/office/word/2018/wordml/cex" xmlns:w16cid="http://schemas.microsoft.com/office/word/2016/wordml/cid" xmlns:w16="http://schemas.microsoft.com/office/word/2018/wordml" xmlns:w16du="http://schemas.microsoft.com/office/word/2023/wordml/word16du" xmlns:w16sdtdh="http://schemas.microsoft.com/office/word/2020/wordml/sdtdatahash" xmlns:w16sdtfl="http://schemas.microsoft.com/office/word/2024/wordml/sdtformatlock" xmlns:w16se="http://schemas.microsoft.com/office/word/2015/wordml/symex" xmlns:wpg="http://schemas.microsoft.com/office/word/2010/wordprocessingGroup" xmlns:wpi="http://schemas.microsoft.com/office/word/2010/wordprocessingInk" xmlns:wne="http://schemas.microsoft.com/office/word/2006/wordml" xmlns:wps="http://schemas.microsoft.com/office/word/2010/wordprocessingShape" mc:Ignorable="w14 w15 w16se w16cid w16 w16cex w16sdtdh w16sdtfl w16du wp14">
   <w:p>
     <w:pPr>
       <w:pStyle w:val="En-tte"/>
@@ -5630,7 +5397,7 @@
 </file>
 
 <file path=word/numbering.xml><?xml version="1.0" encoding="utf-8"?>
-<w:numbering xmlns:wpc="http://schemas.microsoft.com/office/word/2010/wordprocessingCanvas" xmlns:cx="http://schemas.microsoft.com/office/drawing/2014/chartex" xmlns:cx1="http://schemas.microsoft.com/office/drawing/2015/9/8/chartex" xmlns:cx2="http://schemas.microsoft.com/office/drawing/2015/10/21/chartex" xmlns:cx3="http://schemas.microsoft.com/office/drawing/2016/5/9/chartex" xmlns:cx4="http://schemas.microsoft.com/office/drawing/2016/5/10/chartex" xmlns:cx5="http://schemas.microsoft.com/office/drawing/2016/5/11/chartex" xmlns:cx6="http://schemas.microsoft.com/office/drawing/2016/5/12/chartex" xmlns:cx7="http://schemas.microsoft.com/office/drawing/2016/5/13/chartex" xmlns:cx8="http://schemas.microsoft.com/office/drawing/2016/5/14/chartex" xmlns:mc="http://schemas.openxmlformats.org/markup-compatibility/2006" xmlns:aink="http://schemas.microsoft.com/office/drawing/2016/ink" xmlns:am3d="http://schemas.microsoft.com/office/drawing/2017/model3d" xmlns:o="urn:schemas-microsoft-com:office:office" xmlns:oel="http://schemas.microsoft.com/office/2019/extlst" xmlns:r="http://schemas.openxmlformats.org/officeDocument/2006/relationships" xmlns:m="http://schemas.openxmlformats.org/officeDocument/2006/math" xmlns:v="urn:schemas-microsoft-com:vml" xmlns:wp14="http://schemas.microsoft.com/office/word/2010/wordprocessingDrawing" xmlns:wp="http://schemas.openxmlformats.org/drawingml/2006/wordprocessingDrawing" xmlns:w10="urn:schemas-microsoft-com:office:word" xmlns:w="http://schemas.openxmlformats.org/wordprocessingml/2006/main" xmlns:w14="http://schemas.microsoft.com/office/word/2010/wordml" xmlns:w15="http://schemas.microsoft.com/office/word/2012/wordml" xmlns:w16cex="http://schemas.microsoft.com/office/word/2018/wordml/cex" xmlns:w16cid="http://schemas.microsoft.com/office/word/2016/wordml/cid" xmlns:w16="http://schemas.microsoft.com/office/word/2018/wordml" xmlns:w16du="http://schemas.microsoft.com/office/word/2023/wordml/word16du" xmlns:w16sdtdh="http://schemas.microsoft.com/office/word/2020/wordml/sdtdatahash" xmlns:w16sdtfl="http://schemas.microsoft.com/office/word/2024/wordml/sdtformatlock" xmlns:w16se="http://schemas.microsoft.com/office/word/2015/wordml/symex" xmlns:wpg="http://schemas.microsoft.com/office/word/2010/wordprocessingGroup" xmlns:wpi="http://schemas.microsoft.com/office/word/2010/wordprocessingInk" xmlns:wne="http://schemas.microsoft.com/office/word/2006/wordml" xmlns:wps="http://schemas.microsoft.com/office/word/2010/wordprocessingShape" mc:Ignorable="w14 w15 w16se w16cid w16 w16cex w16sdtdh w16sdtfl w16du wp14">
+<w:numbering xmlns:wpc="http://schemas.microsoft.com/office/word/2010/wordprocessingCanvas" xmlns:cx="http://schemas.microsoft.com/office/drawing/2014/chartex" xmlns:cx1="http://schemas.microsoft.com/office/drawing/2015/9/8/chartex" xmlns:cx2="http://schemas.microsoft.com/office/drawing/2015/10/21/chartex" xmlns:cx3="http://schemas.microsoft.com/office/drawing/2016/5/9/chartex" xmlns:cx4="http://schemas.microsoft.com/office/drawing/2016/5/10/chartex" xmlns:cx5="http://schemas.microsoft.com/office/drawing/2016/5/11/chartex" xmlns:cx6="http://schemas.microsoft.com/office/drawing/2016/5/12/chartex" xmlns:cx7="http://schemas.microsoft.com/office/drawing/2016/5/13/chartex" xmlns:cx8="http://schemas.microsoft.com/office/drawing/2016/5/14/chartex" xmlns:mc="http://schemas.openxmlformats.org/markup-compatibility/2006" xmlns:aink="http://schemas.microsoft.com/office/drawing/2016/ink" xmlns:am3d="http://schemas.microsoft.com/office/drawing/2017/model3d" xmlns:o="urn:schemas-microsoft-com:office:office" xmlns:oel="http://schemas.microsoft.com/office/2019/extlst" xmlns:r="http://schemas.openxmlformats.org/officeDocument/2006/relationships" xmlns:m="http://schemas.openxmlformats.org/officeDocument/2006/math" xmlns:v="urn:schemas-microsoft-com:vml" xmlns:wp14="http://schemas.microsoft.com/office/word/2010/wordprocessingDrawing" xmlns:wp="http://schemas.openxmlformats.org/drawingml/2006/wordprocessingDrawing" xmlns:w10="urn:schemas-microsoft-com:office:word" xmlns:w="http://schemas.openxmlformats.org/wordprocessingml/2006/main" xmlns:w14="http://schemas.microsoft.com/office/word/2010/wordml" xmlns:w15="http://schemas.microsoft.com/office/word/2012/wordml" xmlns:w16cei="http://schemas.microsoft.com/office/word/2026/wordml/cei" xmlns:w16cex="http://schemas.microsoft.com/office/word/2018/wordml/cex" xmlns:w16cid="http://schemas.microsoft.com/office/word/2016/wordml/cid" xmlns:w16="http://schemas.microsoft.com/office/word/2018/wordml" xmlns:w16du="http://schemas.microsoft.com/office/word/2023/wordml/word16du" xmlns:w16sdtdh="http://schemas.microsoft.com/office/word/2020/wordml/sdtdatahash" xmlns:w16sdtfl="http://schemas.microsoft.com/office/word/2024/wordml/sdtformatlock" xmlns:w16se="http://schemas.microsoft.com/office/word/2015/wordml/symex" xmlns:wpg="http://schemas.microsoft.com/office/word/2010/wordprocessingGroup" xmlns:wpi="http://schemas.microsoft.com/office/word/2010/wordprocessingInk" xmlns:wne="http://schemas.microsoft.com/office/word/2006/wordml" xmlns:wps="http://schemas.microsoft.com/office/word/2010/wordprocessingShape" mc:Ignorable="w14 w15 w16se w16cid w16 w16cex w16sdtdh w16sdtfl w16du wp14">
   <w:abstractNum w:abstractNumId="0" w15:restartNumberingAfterBreak="0">
     <w:nsid w:val="05D97D4B"/>
     <w:multiLevelType w:val="hybridMultilevel"/>
@@ -7449,9 +7216,10 @@
     <w:basedOn w:val="Normal"/>
     <w:next w:val="Normal"/>
     <w:link w:val="Titre1Car"/>
+    <w:autoRedefine/>
     <w:uiPriority w:val="9"/>
     <w:qFormat/>
-    <w:rsid w:val="00867C55"/>
+    <w:rsid w:val="006D2E7F"/>
     <w:pPr>
       <w:keepNext/>
       <w:keepLines/>
@@ -7459,7 +7227,7 @@
       <w:outlineLvl w:val="0"/>
     </w:pPr>
     <w:rPr>
-      <w:rFonts w:ascii="Times New Roman" w:eastAsiaTheme="majorEastAsia" w:hAnsi="Times New Roman" w:cstheme="majorBidi"/>
+      <w:rFonts w:eastAsiaTheme="majorEastAsia" w:cstheme="majorBidi"/>
       <w:b/>
       <w:caps/>
       <w:color w:val="000000" w:themeColor="text1"/>
@@ -7472,10 +7240,11 @@
     <w:basedOn w:val="Normal"/>
     <w:next w:val="Normal"/>
     <w:link w:val="Titre2Car"/>
+    <w:autoRedefine/>
     <w:uiPriority w:val="9"/>
     <w:unhideWhenUsed/>
     <w:qFormat/>
-    <w:rsid w:val="00867C55"/>
+    <w:rsid w:val="006D2E7F"/>
     <w:pPr>
       <w:keepNext/>
       <w:keepLines/>
@@ -7483,7 +7252,7 @@
       <w:outlineLvl w:val="1"/>
     </w:pPr>
     <w:rPr>
-      <w:rFonts w:ascii="Times New Roman" w:eastAsiaTheme="majorEastAsia" w:hAnsi="Times New Roman" w:cstheme="majorBidi"/>
+      <w:rFonts w:eastAsiaTheme="majorEastAsia" w:cstheme="majorBidi"/>
       <w:b/>
       <w:color w:val="000000" w:themeColor="text1"/>
       <w:sz w:val="32"/>
@@ -7495,6 +7264,7 @@
     <w:basedOn w:val="Normal"/>
     <w:next w:val="Normal"/>
     <w:link w:val="Titre3Car"/>
+    <w:autoRedefine/>
     <w:uiPriority w:val="9"/>
     <w:unhideWhenUsed/>
     <w:qFormat/>
@@ -7649,6 +7419,7 @@
   <w:style w:type="character" w:default="1" w:styleId="Policepardfaut">
     <w:name w:val="Default Paragraph Font"/>
     <w:uiPriority w:val="1"/>
+    <w:semiHidden/>
     <w:unhideWhenUsed/>
   </w:style>
   <w:style w:type="table" w:default="1" w:styleId="TableauNormal">
@@ -7677,9 +7448,9 @@
     <w:basedOn w:val="Policepardfaut"/>
     <w:link w:val="Titre1"/>
     <w:uiPriority w:val="9"/>
-    <w:rsid w:val="00867C55"/>
+    <w:rsid w:val="006D2E7F"/>
     <w:rPr>
-      <w:rFonts w:ascii="Times New Roman" w:eastAsiaTheme="majorEastAsia" w:hAnsi="Times New Roman" w:cstheme="majorBidi"/>
+      <w:rFonts w:ascii="Arial" w:eastAsiaTheme="majorEastAsia" w:hAnsi="Arial" w:cstheme="majorBidi"/>
       <w:b/>
       <w:caps/>
       <w:color w:val="000000" w:themeColor="text1"/>
@@ -7695,9 +7466,9 @@
     <w:basedOn w:val="Policepardfaut"/>
     <w:link w:val="Titre2"/>
     <w:uiPriority w:val="9"/>
-    <w:rsid w:val="00867C55"/>
+    <w:rsid w:val="006D2E7F"/>
     <w:rPr>
-      <w:rFonts w:ascii="Times New Roman" w:eastAsiaTheme="majorEastAsia" w:hAnsi="Times New Roman" w:cstheme="majorBidi"/>
+      <w:rFonts w:ascii="Arial" w:eastAsiaTheme="majorEastAsia" w:hAnsi="Arial" w:cstheme="majorBidi"/>
       <w:b/>
       <w:color w:val="000000" w:themeColor="text1"/>
       <w:kern w:val="0"/>

</xml_diff>

<commit_message>
Modification de la redirection partant de Next.js.org à /login ou /dashboard
</commit_message>
<xml_diff>
--- a/RAPPORT DE STAGE.docx
+++ b/RAPPORT DE STAGE.docx
@@ -844,45 +844,32 @@
                               </w:rPr>
                               <w:t xml:space="preserve">: </w:t>
                             </w:r>
-                            <w:r>
-                              <w:fldChar w:fldCharType="begin"/>
-                            </w:r>
-                            <w:r>
-                              <w:rPr>
-                                <w:lang w:val="en-US"/>
-                              </w:rPr>
-                              <w:instrText>HYPERLINK "https://www.new.iai-togo.tg/"</w:instrText>
-                            </w:r>
-                            <w:r>
-                              <w:fldChar w:fldCharType="separate"/>
-                            </w:r>
-                            <w:r>
-                              <w:rPr>
-                                <w:rStyle w:val="Lienhypertexte"/>
-                                <w:szCs w:val="24"/>
-                                <w:lang w:val="en-US"/>
-                              </w:rPr>
-                              <w:t>www</w:t>
-                            </w:r>
-                            <w:r>
-                              <w:rPr>
-                                <w:rStyle w:val="Lienhypertexte"/>
-                                <w:szCs w:val="24"/>
-                                <w:lang w:val="en-US"/>
-                              </w:rPr>
-                              <w:t>.new</w:t>
-                            </w:r>
-                            <w:r>
-                              <w:rPr>
-                                <w:rStyle w:val="Lienhypertexte"/>
-                                <w:szCs w:val="24"/>
-                                <w:lang w:val="en-US"/>
-                              </w:rPr>
-                              <w:t>.iai-togo.com</w:t>
-                            </w:r>
-                            <w:r>
-                              <w:fldChar w:fldCharType="end"/>
-                            </w:r>
+                            <w:hyperlink r:id="rId10" w:history="1">
+                              <w:r>
+                                <w:rPr>
+                                  <w:rStyle w:val="Lienhypertexte"/>
+                                  <w:szCs w:val="24"/>
+                                  <w:lang w:val="en-US"/>
+                                </w:rPr>
+                                <w:t>www</w:t>
+                              </w:r>
+                              <w:r>
+                                <w:rPr>
+                                  <w:rStyle w:val="Lienhypertexte"/>
+                                  <w:szCs w:val="24"/>
+                                  <w:lang w:val="en-US"/>
+                                </w:rPr>
+                                <w:t>.new</w:t>
+                              </w:r>
+                              <w:r>
+                                <w:rPr>
+                                  <w:rStyle w:val="Lienhypertexte"/>
+                                  <w:szCs w:val="24"/>
+                                  <w:lang w:val="en-US"/>
+                                </w:rPr>
+                                <w:t>.iai-togo.com</w:t>
+                              </w:r>
+                            </w:hyperlink>
                           </w:p>
                         </w:txbxContent>
                       </wps:txbx>
@@ -1070,7 +1057,7 @@
                         </w:rPr>
                         <w:t xml:space="preserve"> : </w:t>
                       </w:r>
-                      <w:hyperlink r:id="rId10" w:history="1">
+                      <w:hyperlink r:id="rId11" w:history="1">
                         <w:r>
                           <w:rPr>
                             <w:rStyle w:val="Lienhypertexte"/>
@@ -1105,45 +1092,32 @@
                         </w:rPr>
                         <w:t xml:space="preserve">: </w:t>
                       </w:r>
-                      <w:r>
-                        <w:fldChar w:fldCharType="begin"/>
-                      </w:r>
-                      <w:r>
-                        <w:rPr>
-                          <w:lang w:val="en-US"/>
-                        </w:rPr>
-                        <w:instrText>HYPERLINK "https://www.new.iai-togo.tg/"</w:instrText>
-                      </w:r>
-                      <w:r>
-                        <w:fldChar w:fldCharType="separate"/>
-                      </w:r>
-                      <w:r>
-                        <w:rPr>
-                          <w:rStyle w:val="Lienhypertexte"/>
-                          <w:szCs w:val="24"/>
-                          <w:lang w:val="en-US"/>
-                        </w:rPr>
-                        <w:t>www</w:t>
-                      </w:r>
-                      <w:r>
-                        <w:rPr>
-                          <w:rStyle w:val="Lienhypertexte"/>
-                          <w:szCs w:val="24"/>
-                          <w:lang w:val="en-US"/>
-                        </w:rPr>
-                        <w:t>.new</w:t>
-                      </w:r>
-                      <w:r>
-                        <w:rPr>
-                          <w:rStyle w:val="Lienhypertexte"/>
-                          <w:szCs w:val="24"/>
-                          <w:lang w:val="en-US"/>
-                        </w:rPr>
-                        <w:t>.iai-togo.com</w:t>
-                      </w:r>
-                      <w:r>
-                        <w:fldChar w:fldCharType="end"/>
-                      </w:r>
+                      <w:hyperlink r:id="rId12" w:history="1">
+                        <w:r>
+                          <w:rPr>
+                            <w:rStyle w:val="Lienhypertexte"/>
+                            <w:szCs w:val="24"/>
+                            <w:lang w:val="en-US"/>
+                          </w:rPr>
+                          <w:t>www</w:t>
+                        </w:r>
+                        <w:r>
+                          <w:rPr>
+                            <w:rStyle w:val="Lienhypertexte"/>
+                            <w:szCs w:val="24"/>
+                            <w:lang w:val="en-US"/>
+                          </w:rPr>
+                          <w:t>.new</w:t>
+                        </w:r>
+                        <w:r>
+                          <w:rPr>
+                            <w:rStyle w:val="Lienhypertexte"/>
+                            <w:szCs w:val="24"/>
+                            <w:lang w:val="en-US"/>
+                          </w:rPr>
+                          <w:t>.iai-togo.com</w:t>
+                        </w:r>
+                      </w:hyperlink>
                     </w:p>
                   </w:txbxContent>
                 </v:textbox>
@@ -1223,7 +1197,7 @@
                                           <pic:cNvPicPr/>
                                         </pic:nvPicPr>
                                         <pic:blipFill>
-                                          <a:blip r:embed="rId11">
+                                          <a:blip r:embed="rId13">
                                             <a:extLst>
                                               <a:ext uri="{28A0092B-C50C-407E-A947-70E740481C1C}">
                                                 <a14:useLocalDpi xmlns:a14="http://schemas.microsoft.com/office/drawing/2010/main" val="0"/>
@@ -1405,7 +1379,7 @@
                               </w:rPr>
                               <w:t xml:space="preserve"> </w:t>
                             </w:r>
-                            <w:hyperlink r:id="rId12" w:history="1">
+                            <w:hyperlink r:id="rId14" w:history="1">
                               <w:r>
                                 <w:rPr>
                                   <w:rStyle w:val="Lienhypertexte"/>
@@ -1448,7 +1422,7 @@
                               </w:rPr>
                               <w:t xml:space="preserve"> </w:t>
                             </w:r>
-                            <w:hyperlink r:id="rId13" w:history="1">
+                            <w:hyperlink r:id="rId15" w:history="1">
                               <w:r>
                                 <w:rPr>
                                   <w:rStyle w:val="Lienhypertexte"/>
@@ -1524,7 +1498,7 @@
                                     <pic:cNvPicPr/>
                                   </pic:nvPicPr>
                                   <pic:blipFill>
-                                    <a:blip r:embed="rId11">
+                                    <a:blip r:embed="rId13">
                                       <a:extLst>
                                         <a:ext uri="{28A0092B-C50C-407E-A947-70E740481C1C}">
                                           <a14:useLocalDpi xmlns:a14="http://schemas.microsoft.com/office/drawing/2010/main" val="0"/>
@@ -1706,7 +1680,7 @@
                         </w:rPr>
                         <w:t xml:space="preserve"> </w:t>
                       </w:r>
-                      <w:hyperlink r:id="rId14" w:history="1">
+                      <w:hyperlink r:id="rId16" w:history="1">
                         <w:r>
                           <w:rPr>
                             <w:rStyle w:val="Lienhypertexte"/>
@@ -1749,7 +1723,7 @@
                         </w:rPr>
                         <w:t xml:space="preserve"> </w:t>
                       </w:r>
-                      <w:hyperlink r:id="rId15" w:history="1">
+                      <w:hyperlink r:id="rId17" w:history="1">
                         <w:r>
                           <w:rPr>
                             <w:rStyle w:val="Lienhypertexte"/>
@@ -3468,7 +3442,7 @@
         <w:spacing w:before="0"/>
         <w:ind w:left="360"/>
         <w:sectPr>
-          <w:footerReference w:type="default" r:id="rId16"/>
+          <w:footerReference w:type="default" r:id="rId18"/>
           <w:pgSz w:w="11906" w:h="16838" w:code="9"/>
           <w:pgMar w:top="1418" w:right="1418" w:bottom="1418" w:left="1418" w:header="720" w:footer="720" w:gutter="0"/>
           <w:pgNumType w:fmt="upperRoman" w:start="1"/>
@@ -4521,7 +4495,7 @@
                     <pic:cNvPicPr/>
                   </pic:nvPicPr>
                   <pic:blipFill>
-                    <a:blip r:embed="rId17" cstate="print">
+                    <a:blip r:embed="rId19" cstate="print">
                       <a:extLst>
                         <a:ext uri="{28A0092B-C50C-407E-A947-70E740481C1C}">
                           <a14:useLocalDpi xmlns:a14="http://schemas.microsoft.com/office/drawing/2010/main" val="0"/>
@@ -5161,7 +5135,7 @@
                     <pic:cNvPicPr/>
                   </pic:nvPicPr>
                   <pic:blipFill>
-                    <a:blip r:embed="rId18"/>
+                    <a:blip r:embed="rId20"/>
                     <a:stretch>
                       <a:fillRect/>
                     </a:stretch>
@@ -10906,7 +10880,7 @@
                     <pic:cNvPicPr/>
                   </pic:nvPicPr>
                   <pic:blipFill>
-                    <a:blip r:embed="rId19">
+                    <a:blip r:embed="rId21">
                       <a:extLst>
                         <a:ext uri="{28A0092B-C50C-407E-A947-70E740481C1C}">
                           <a14:useLocalDpi xmlns:a14="http://schemas.microsoft.com/office/drawing/2010/main" val="0"/>
@@ -16241,21 +16215,30 @@
                 <w:szCs w:val="24"/>
                 <w:lang w:val="fr-TG"/>
               </w:rPr>
-              <w:t>o</w:t>
-            </w:r>
-            <w:r>
-              <w:rPr>
-                <w:rFonts w:ascii="Times New Roman" w:hAnsi="Times New Roman" w:cs="Times New Roman"/>
-                <w:b/>
-                <w:bCs/>
+              <w:t>ouvert</w:t>
+            </w:r>
+            <w:r>
+              <w:rPr>
+                <w:rFonts w:ascii="Times New Roman" w:hAnsi="Times New Roman" w:cs="Times New Roman"/>
                 <w:spacing w:val="-6"/>
                 <w:sz w:val="24"/>
                 <w:szCs w:val="24"/>
                 <w:lang w:val="fr-TG"/>
               </w:rPr>
-              <w:t>uvert</w:t>
-            </w:r>
-            <w:r>
+              <w:t xml:space="preserve">. </w:t>
+            </w:r>
+          </w:p>
+          <w:p>
+            <w:pPr>
+              <w:pStyle w:val="TableParagraph"/>
+              <w:numPr>
+                <w:ilvl w:val="0"/>
+                <w:numId w:val="34"/>
+              </w:numPr>
+              <w:tabs>
+                <w:tab w:val="left" w:pos="829"/>
+              </w:tabs>
+              <w:spacing w:line="278" w:lineRule="exact"/>
               <w:rPr>
                 <w:rFonts w:ascii="Times New Roman" w:hAnsi="Times New Roman" w:cs="Times New Roman"/>
                 <w:spacing w:val="-6"/>
@@ -16263,7 +16246,24 @@
                 <w:szCs w:val="24"/>
                 <w:lang w:val="fr-TG"/>
               </w:rPr>
-              <w:t xml:space="preserve">. </w:t>
+            </w:pPr>
+            <w:r>
+              <w:rPr>
+                <w:rFonts w:ascii="Times New Roman" w:hAnsi="Times New Roman" w:cs="Times New Roman"/>
+                <w:spacing w:val="-6"/>
+                <w:sz w:val="24"/>
+                <w:szCs w:val="24"/>
+              </w:rPr>
+              <w:t>I</w:t>
+            </w:r>
+            <w:r>
+              <w:rPr>
+                <w:rFonts w:ascii="Times New Roman" w:hAnsi="Times New Roman" w:cs="Times New Roman"/>
+                <w:spacing w:val="-6"/>
+                <w:sz w:val="24"/>
+                <w:szCs w:val="24"/>
+              </w:rPr>
+              <w:t>l consulte les suggestions d'affectation.</w:t>
             </w:r>
           </w:p>
           <w:p>
@@ -16820,15 +16820,7 @@
                 <w:sz w:val="24"/>
                 <w:lang w:val="fr-TG"/>
               </w:rPr>
-              <w:t xml:space="preserve"> </w:t>
-            </w:r>
-            <w:r>
-              <w:rPr>
-                <w:rFonts w:ascii="Times New Roman" w:hAnsi="Times New Roman" w:cs="Times New Roman"/>
-                <w:sz w:val="24"/>
-                <w:lang w:val="fr-TG"/>
-              </w:rPr>
-              <w:t>4 du scénario nominal</w:t>
+              <w:t xml:space="preserve"> 4 du scénario nominal</w:t>
             </w:r>
           </w:p>
           <w:p>
@@ -17071,8 +17063,8 @@
     </w:p>
     <w:p/>
     <w:sectPr>
-      <w:headerReference w:type="default" r:id="rId20"/>
-      <w:footerReference w:type="default" r:id="rId21"/>
+      <w:headerReference w:type="default" r:id="rId22"/>
+      <w:footerReference w:type="default" r:id="rId23"/>
       <w:pgSz w:w="11906" w:h="16838" w:code="9"/>
       <w:pgMar w:top="1418" w:right="1418" w:bottom="1418" w:left="1418" w:header="720" w:footer="720" w:gutter="0"/>
       <w:cols w:space="720"/>

</xml_diff>

<commit_message>
modif de la couleur en bg
</commit_message>
<xml_diff>
--- a/RAPPORT DE STAGE.docx
+++ b/RAPPORT DE STAGE.docx
@@ -844,32 +844,45 @@
                               </w:rPr>
                               <w:t xml:space="preserve">: </w:t>
                             </w:r>
-                            <w:hyperlink r:id="rId10" w:history="1">
-                              <w:r>
-                                <w:rPr>
-                                  <w:rStyle w:val="Lienhypertexte"/>
-                                  <w:szCs w:val="24"/>
-                                  <w:lang w:val="en-US"/>
-                                </w:rPr>
-                                <w:t>www</w:t>
-                              </w:r>
-                              <w:r>
-                                <w:rPr>
-                                  <w:rStyle w:val="Lienhypertexte"/>
-                                  <w:szCs w:val="24"/>
-                                  <w:lang w:val="en-US"/>
-                                </w:rPr>
-                                <w:t>.new</w:t>
-                              </w:r>
-                              <w:r>
-                                <w:rPr>
-                                  <w:rStyle w:val="Lienhypertexte"/>
-                                  <w:szCs w:val="24"/>
-                                  <w:lang w:val="en-US"/>
-                                </w:rPr>
-                                <w:t>.iai-togo.com</w:t>
-                              </w:r>
-                            </w:hyperlink>
+                            <w:r>
+                              <w:fldChar w:fldCharType="begin"/>
+                            </w:r>
+                            <w:r>
+                              <w:rPr>
+                                <w:lang w:val="en-US"/>
+                              </w:rPr>
+                              <w:instrText>HYPERLINK "https://www.new.iai-togo.tg/"</w:instrText>
+                            </w:r>
+                            <w:r>
+                              <w:fldChar w:fldCharType="separate"/>
+                            </w:r>
+                            <w:r>
+                              <w:rPr>
+                                <w:rStyle w:val="Lienhypertexte"/>
+                                <w:szCs w:val="24"/>
+                                <w:lang w:val="en-US"/>
+                              </w:rPr>
+                              <w:t>www</w:t>
+                            </w:r>
+                            <w:r>
+                              <w:rPr>
+                                <w:rStyle w:val="Lienhypertexte"/>
+                                <w:szCs w:val="24"/>
+                                <w:lang w:val="en-US"/>
+                              </w:rPr>
+                              <w:t>.new</w:t>
+                            </w:r>
+                            <w:r>
+                              <w:rPr>
+                                <w:rStyle w:val="Lienhypertexte"/>
+                                <w:szCs w:val="24"/>
+                                <w:lang w:val="en-US"/>
+                              </w:rPr>
+                              <w:t>.iai-togo.com</w:t>
+                            </w:r>
+                            <w:r>
+                              <w:fldChar w:fldCharType="end"/>
+                            </w:r>
                           </w:p>
                         </w:txbxContent>
                       </wps:txbx>
@@ -1057,7 +1070,7 @@
                         </w:rPr>
                         <w:t xml:space="preserve"> : </w:t>
                       </w:r>
-                      <w:hyperlink r:id="rId11" w:history="1">
+                      <w:hyperlink r:id="rId10" w:history="1">
                         <w:r>
                           <w:rPr>
                             <w:rStyle w:val="Lienhypertexte"/>
@@ -1092,32 +1105,45 @@
                         </w:rPr>
                         <w:t xml:space="preserve">: </w:t>
                       </w:r>
-                      <w:hyperlink r:id="rId12" w:history="1">
-                        <w:r>
-                          <w:rPr>
-                            <w:rStyle w:val="Lienhypertexte"/>
-                            <w:szCs w:val="24"/>
-                            <w:lang w:val="en-US"/>
-                          </w:rPr>
-                          <w:t>www</w:t>
-                        </w:r>
-                        <w:r>
-                          <w:rPr>
-                            <w:rStyle w:val="Lienhypertexte"/>
-                            <w:szCs w:val="24"/>
-                            <w:lang w:val="en-US"/>
-                          </w:rPr>
-                          <w:t>.new</w:t>
-                        </w:r>
-                        <w:r>
-                          <w:rPr>
-                            <w:rStyle w:val="Lienhypertexte"/>
-                            <w:szCs w:val="24"/>
-                            <w:lang w:val="en-US"/>
-                          </w:rPr>
-                          <w:t>.iai-togo.com</w:t>
-                        </w:r>
-                      </w:hyperlink>
+                      <w:r>
+                        <w:fldChar w:fldCharType="begin"/>
+                      </w:r>
+                      <w:r>
+                        <w:rPr>
+                          <w:lang w:val="en-US"/>
+                        </w:rPr>
+                        <w:instrText>HYPERLINK "https://www.new.iai-togo.tg/"</w:instrText>
+                      </w:r>
+                      <w:r>
+                        <w:fldChar w:fldCharType="separate"/>
+                      </w:r>
+                      <w:r>
+                        <w:rPr>
+                          <w:rStyle w:val="Lienhypertexte"/>
+                          <w:szCs w:val="24"/>
+                          <w:lang w:val="en-US"/>
+                        </w:rPr>
+                        <w:t>www</w:t>
+                      </w:r>
+                      <w:r>
+                        <w:rPr>
+                          <w:rStyle w:val="Lienhypertexte"/>
+                          <w:szCs w:val="24"/>
+                          <w:lang w:val="en-US"/>
+                        </w:rPr>
+                        <w:t>.new</w:t>
+                      </w:r>
+                      <w:r>
+                        <w:rPr>
+                          <w:rStyle w:val="Lienhypertexte"/>
+                          <w:szCs w:val="24"/>
+                          <w:lang w:val="en-US"/>
+                        </w:rPr>
+                        <w:t>.iai-togo.com</w:t>
+                      </w:r>
+                      <w:r>
+                        <w:fldChar w:fldCharType="end"/>
+                      </w:r>
                     </w:p>
                   </w:txbxContent>
                 </v:textbox>
@@ -1197,7 +1223,7 @@
                                           <pic:cNvPicPr/>
                                         </pic:nvPicPr>
                                         <pic:blipFill>
-                                          <a:blip r:embed="rId13">
+                                          <a:blip r:embed="rId11">
                                             <a:extLst>
                                               <a:ext uri="{28A0092B-C50C-407E-A947-70E740481C1C}">
                                                 <a14:useLocalDpi xmlns:a14="http://schemas.microsoft.com/office/drawing/2010/main" val="0"/>
@@ -1255,8 +1281,16 @@
                               <w:rPr>
                                 <w:szCs w:val="24"/>
                               </w:rPr>
-                              <w:t>Quartier Djidjolé</w:t>
+                              <w:t xml:space="preserve">Quartier </w:t>
                             </w:r>
+                            <w:proofErr w:type="spellStart"/>
+                            <w:r>
+                              <w:rPr>
+                                <w:szCs w:val="24"/>
+                              </w:rPr>
+                              <w:t>Djidjolé</w:t>
+                            </w:r>
+                            <w:proofErr w:type="spellEnd"/>
                             <w:r>
                               <w:rPr>
                                 <w:szCs w:val="24"/>
@@ -1379,7 +1413,7 @@
                               </w:rPr>
                               <w:t xml:space="preserve"> </w:t>
                             </w:r>
-                            <w:hyperlink r:id="rId14" w:history="1">
+                            <w:hyperlink r:id="rId12" w:history="1">
                               <w:r>
                                 <w:rPr>
                                   <w:rStyle w:val="Lienhypertexte"/>
@@ -1422,7 +1456,7 @@
                               </w:rPr>
                               <w:t xml:space="preserve"> </w:t>
                             </w:r>
-                            <w:hyperlink r:id="rId15" w:history="1">
+                            <w:hyperlink r:id="rId13" w:history="1">
                               <w:r>
                                 <w:rPr>
                                   <w:rStyle w:val="Lienhypertexte"/>
@@ -1498,7 +1532,7 @@
                                     <pic:cNvPicPr/>
                                   </pic:nvPicPr>
                                   <pic:blipFill>
-                                    <a:blip r:embed="rId13">
+                                    <a:blip r:embed="rId11">
                                       <a:extLst>
                                         <a:ext uri="{28A0092B-C50C-407E-A947-70E740481C1C}">
                                           <a14:useLocalDpi xmlns:a14="http://schemas.microsoft.com/office/drawing/2010/main" val="0"/>
@@ -1556,8 +1590,16 @@
                         <w:rPr>
                           <w:szCs w:val="24"/>
                         </w:rPr>
-                        <w:t>Quartier Djidjolé</w:t>
+                        <w:t xml:space="preserve">Quartier </w:t>
                       </w:r>
+                      <w:proofErr w:type="spellStart"/>
+                      <w:r>
+                        <w:rPr>
+                          <w:szCs w:val="24"/>
+                        </w:rPr>
+                        <w:t>Djidjolé</w:t>
+                      </w:r>
+                      <w:proofErr w:type="spellEnd"/>
                       <w:r>
                         <w:rPr>
                           <w:szCs w:val="24"/>
@@ -1680,7 +1722,7 @@
                         </w:rPr>
                         <w:t xml:space="preserve"> </w:t>
                       </w:r>
-                      <w:hyperlink r:id="rId16" w:history="1">
+                      <w:hyperlink r:id="rId14" w:history="1">
                         <w:r>
                           <w:rPr>
                             <w:rStyle w:val="Lienhypertexte"/>
@@ -1723,7 +1765,7 @@
                         </w:rPr>
                         <w:t xml:space="preserve"> </w:t>
                       </w:r>
-                      <w:hyperlink r:id="rId17" w:history="1">
+                      <w:hyperlink r:id="rId15" w:history="1">
                         <w:r>
                           <w:rPr>
                             <w:rStyle w:val="Lienhypertexte"/>
@@ -1862,12 +1904,14 @@
                               </w:rPr>
                               <w:t xml:space="preserve">: </w:t>
                             </w:r>
+                            <w:proofErr w:type="spellStart"/>
                             <w:r>
                               <w:rPr>
                                 <w:lang w:val="en-US"/>
                               </w:rPr>
                               <w:t>Programmation</w:t>
                             </w:r>
+                            <w:proofErr w:type="spellEnd"/>
                           </w:p>
                           <w:p>
                             <w:pPr>
@@ -2013,12 +2057,14 @@
                         </w:rPr>
                         <w:t xml:space="preserve">: </w:t>
                       </w:r>
+                      <w:proofErr w:type="spellStart"/>
                       <w:r>
                         <w:rPr>
                           <w:lang w:val="en-US"/>
                         </w:rPr>
                         <w:t>Programmation</w:t>
                       </w:r>
+                      <w:proofErr w:type="spellEnd"/>
                     </w:p>
                     <w:p>
                       <w:pPr>
@@ -3442,7 +3488,7 @@
         <w:spacing w:before="0"/>
         <w:ind w:left="360"/>
         <w:sectPr>
-          <w:footerReference w:type="default" r:id="rId18"/>
+          <w:footerReference w:type="default" r:id="rId16"/>
           <w:pgSz w:w="11906" w:h="16838" w:code="9"/>
           <w:pgMar w:top="1418" w:right="1418" w:bottom="1418" w:left="1418" w:header="720" w:footer="720" w:gutter="0"/>
           <w:pgNumType w:fmt="upperRoman" w:start="1"/>
@@ -4495,7 +4541,7 @@
                     <pic:cNvPicPr/>
                   </pic:nvPicPr>
                   <pic:blipFill>
-                    <a:blip r:embed="rId19" cstate="print">
+                    <a:blip r:embed="rId17" cstate="print">
                       <a:extLst>
                         <a:ext uri="{28A0092B-C50C-407E-A947-70E740481C1C}">
                           <a14:useLocalDpi xmlns:a14="http://schemas.microsoft.com/office/drawing/2010/main" val="0"/>
@@ -5076,11 +5122,16 @@
       <w:r>
         <w:t xml:space="preserve">, </w:t>
       </w:r>
+      <w:proofErr w:type="spellStart"/>
       <w:r>
         <w:t>d</w:t>
       </w:r>
       <w:r>
-        <w:t xml:space="preserve">evOps et infrastructure, </w:t>
+        <w:t>evOps</w:t>
+      </w:r>
+      <w:proofErr w:type="spellEnd"/>
+      <w:r>
+        <w:t xml:space="preserve"> et infrastructure, </w:t>
       </w:r>
       <w:r>
         <w:t>i</w:t>
@@ -5135,7 +5186,7 @@
                     <pic:cNvPicPr/>
                   </pic:nvPicPr>
                   <pic:blipFill>
-                    <a:blip r:embed="rId20"/>
+                    <a:blip r:embed="rId18"/>
                     <a:stretch>
                       <a:fillRect/>
                     </a:stretch>
@@ -6805,13 +6856,41 @@
           <w:lang w:val="fr-TG"/>
         </w:rPr>
       </w:pPr>
+      <w:proofErr w:type="spellStart"/>
       <w:r>
         <w:rPr>
           <w:b/>
           <w:bCs/>
           <w:lang w:val="fr-TG"/>
         </w:rPr>
-        <w:t>Zendesk et Freshdesk :</w:t>
+        <w:t>Zendesk</w:t>
+      </w:r>
+      <w:proofErr w:type="spellEnd"/>
+      <w:r>
+        <w:rPr>
+          <w:b/>
+          <w:bCs/>
+          <w:lang w:val="fr-TG"/>
+        </w:rPr>
+        <w:t xml:space="preserve"> et </w:t>
+      </w:r>
+      <w:proofErr w:type="spellStart"/>
+      <w:r>
+        <w:rPr>
+          <w:b/>
+          <w:bCs/>
+          <w:lang w:val="fr-TG"/>
+        </w:rPr>
+        <w:t>Freshdesk</w:t>
+      </w:r>
+      <w:proofErr w:type="spellEnd"/>
+      <w:r>
+        <w:rPr>
+          <w:b/>
+          <w:bCs/>
+          <w:lang w:val="fr-TG"/>
+        </w:rPr>
+        <w:t xml:space="preserve"> :</w:t>
       </w:r>
       <w:r>
         <w:rPr>
@@ -10880,7 +10959,7 @@
                     <pic:cNvPicPr/>
                   </pic:nvPicPr>
                   <pic:blipFill>
-                    <a:blip r:embed="rId21">
+                    <a:blip r:embed="rId19">
                       <a:extLst>
                         <a:ext uri="{28A0092B-C50C-407E-A947-70E740481C1C}">
                           <a14:useLocalDpi xmlns:a14="http://schemas.microsoft.com/office/drawing/2010/main" val="0"/>
@@ -15315,6 +15394,54 @@
         <w:pStyle w:val="Paragraphedeliste"/>
       </w:pPr>
     </w:p>
+    <w:p>
+      <w:pPr>
+        <w:pStyle w:val="Lgende"/>
+        <w:keepNext/>
+        <w:jc w:val="center"/>
+      </w:pPr>
+      <w:r>
+        <w:t xml:space="preserve">Tableau </w:t>
+      </w:r>
+      <w:r>
+        <w:fldChar w:fldCharType="begin"/>
+      </w:r>
+      <w:r>
+        <w:instrText xml:space="preserve"> SEQ Tableau \* ARABIC </w:instrText>
+      </w:r>
+      <w:r>
+        <w:fldChar w:fldCharType="separate"/>
+      </w:r>
+      <w:r>
+        <w:rPr>
+          <w:noProof/>
+        </w:rPr>
+        <w:t>5</w:t>
+      </w:r>
+      <w:r>
+        <w:fldChar w:fldCharType="end"/>
+      </w:r>
+      <w:r>
+        <w:t xml:space="preserve">: </w:t>
+      </w:r>
+      <w:r>
+        <w:t>Description du cas d'utilisation</w:t>
+      </w:r>
+      <w:proofErr w:type="gramStart"/>
+      <w:r>
+        <w:t xml:space="preserve"> «</w:t>
+      </w:r>
+      <w:r>
+        <w:t>Affecter</w:t>
+      </w:r>
+      <w:proofErr w:type="gramEnd"/>
+      <w:r>
+        <w:t xml:space="preserve"> un technicien </w:t>
+      </w:r>
+      <w:r>
+        <w:t>»</w:t>
+      </w:r>
+    </w:p>
     <w:tbl>
       <w:tblPr>
         <w:tblStyle w:val="TableNormal"/>
@@ -17061,7 +17188,219 @@
         <w:pStyle w:val="Paragraphedeliste"/>
       </w:pPr>
     </w:p>
-    <w:p/>
+    <w:p>
+      <w:pPr>
+        <w:pStyle w:val="Titre6"/>
+      </w:pPr>
+      <w:r>
+        <w:lastRenderedPageBreak/>
+        <w:t xml:space="preserve">Diagramme d’activité </w:t>
+      </w:r>
+    </w:p>
+    <w:p>
+      <w:pPr>
+        <w:pStyle w:val="Paragraphedeliste"/>
+        <w:numPr>
+          <w:ilvl w:val="0"/>
+          <w:numId w:val="42"/>
+        </w:numPr>
+      </w:pPr>
+      <w:r>
+        <w:t xml:space="preserve">Description du cas </w:t>
+      </w:r>
+      <w:r>
+        <w:t>«</w:t>
+      </w:r>
+      <w:r>
+        <w:t xml:space="preserve"> S’authentifier </w:t>
+      </w:r>
+      <w:r>
+        <w:t>»</w:t>
+      </w:r>
+    </w:p>
+    <w:p>
+      <w:pPr>
+        <w:keepNext/>
+      </w:pPr>
+      <w:r>
+        <w:rPr>
+          <w:noProof/>
+          <w14:ligatures w14:val="standardContextual"/>
+        </w:rPr>
+        <w:drawing>
+          <wp:inline distT="0" distB="0" distL="0" distR="0" wp14:anchorId="0107EF99" wp14:editId="4B15D800">
+            <wp:extent cx="5759450" cy="6600190"/>
+            <wp:effectExtent l="19050" t="19050" r="12700" b="10160"/>
+            <wp:docPr id="334233149" name="Image 17"/>
+            <wp:cNvGraphicFramePr>
+              <a:graphicFrameLocks xmlns:a="http://schemas.openxmlformats.org/drawingml/2006/main" noChangeAspect="1"/>
+            </wp:cNvGraphicFramePr>
+            <a:graphic xmlns:a="http://schemas.openxmlformats.org/drawingml/2006/main">
+              <a:graphicData uri="http://schemas.openxmlformats.org/drawingml/2006/picture">
+                <pic:pic xmlns:pic="http://schemas.openxmlformats.org/drawingml/2006/picture">
+                  <pic:nvPicPr>
+                    <pic:cNvPr id="334233149" name="Image 334233149"/>
+                    <pic:cNvPicPr/>
+                  </pic:nvPicPr>
+                  <pic:blipFill>
+                    <a:blip r:embed="rId20">
+                      <a:extLst>
+                        <a:ext uri="{28A0092B-C50C-407E-A947-70E740481C1C}">
+                          <a14:useLocalDpi xmlns:a14="http://schemas.microsoft.com/office/drawing/2010/main" val="0"/>
+                        </a:ext>
+                      </a:extLst>
+                    </a:blip>
+                    <a:stretch>
+                      <a:fillRect/>
+                    </a:stretch>
+                  </pic:blipFill>
+                  <pic:spPr>
+                    <a:xfrm>
+                      <a:off x="0" y="0"/>
+                      <a:ext cx="5759450" cy="6600190"/>
+                    </a:xfrm>
+                    <a:prstGeom prst="rect">
+                      <a:avLst/>
+                    </a:prstGeom>
+                    <a:ln>
+                      <a:solidFill>
+                        <a:schemeClr val="accent5">
+                          <a:lumMod val="40000"/>
+                          <a:lumOff val="60000"/>
+                        </a:schemeClr>
+                      </a:solidFill>
+                    </a:ln>
+                  </pic:spPr>
+                </pic:pic>
+              </a:graphicData>
+            </a:graphic>
+          </wp:inline>
+        </w:drawing>
+      </w:r>
+    </w:p>
+    <w:p>
+      <w:pPr>
+        <w:pStyle w:val="Lgende"/>
+        <w:jc w:val="center"/>
+      </w:pPr>
+      <w:r>
+        <w:t xml:space="preserve">Figure </w:t>
+      </w:r>
+      <w:r>
+        <w:fldChar w:fldCharType="begin"/>
+      </w:r>
+      <w:r>
+        <w:instrText xml:space="preserve"> SEQ Figure \* ARABIC </w:instrText>
+      </w:r>
+      <w:r>
+        <w:fldChar w:fldCharType="separate"/>
+      </w:r>
+      <w:r>
+        <w:rPr>
+          <w:noProof/>
+        </w:rPr>
+        <w:t>4</w:t>
+      </w:r>
+      <w:r>
+        <w:fldChar w:fldCharType="end"/>
+      </w:r>
+      <w:r>
+        <w:t xml:space="preserve">: </w:t>
+      </w:r>
+      <w:r>
+        <w:t xml:space="preserve">Diagramme d'activité du cas </w:t>
+      </w:r>
+      <w:r>
+        <w:t xml:space="preserve">d'utilisation </w:t>
+      </w:r>
+      <w:r>
+        <w:t>« S'authentifier »</w:t>
+      </w:r>
+    </w:p>
+    <w:p>
+      <w:r>
+        <w:t xml:space="preserve">     </w:t>
+      </w:r>
+    </w:p>
+    <w:p>
+      <w:pPr>
+        <w:pStyle w:val="Paragraphedeliste"/>
+        <w:numPr>
+          <w:ilvl w:val="0"/>
+          <w:numId w:val="42"/>
+        </w:numPr>
+      </w:pPr>
+      <w:r>
+        <w:t xml:space="preserve">Description du cas </w:t>
+      </w:r>
+      <w:r>
+        <w:t>«</w:t>
+      </w:r>
+      <w:r>
+        <w:t xml:space="preserve"> Créer un ticket </w:t>
+      </w:r>
+      <w:r>
+        <w:t>»</w:t>
+      </w:r>
+    </w:p>
+    <w:p>
+      <w:r>
+        <w:rPr>
+          <w:noProof/>
+          <w14:ligatures w14:val="standardContextual"/>
+        </w:rPr>
+        <w:lastRenderedPageBreak/>
+        <w:drawing>
+          <wp:inline distT="0" distB="0" distL="0" distR="0" wp14:anchorId="3E900D98" wp14:editId="797CBBE2">
+            <wp:extent cx="5759450" cy="7504430"/>
+            <wp:effectExtent l="19050" t="19050" r="12700" b="20320"/>
+            <wp:docPr id="1492476383" name="Image 18"/>
+            <wp:cNvGraphicFramePr>
+              <a:graphicFrameLocks xmlns:a="http://schemas.openxmlformats.org/drawingml/2006/main" noChangeAspect="1"/>
+            </wp:cNvGraphicFramePr>
+            <a:graphic xmlns:a="http://schemas.openxmlformats.org/drawingml/2006/main">
+              <a:graphicData uri="http://schemas.openxmlformats.org/drawingml/2006/picture">
+                <pic:pic xmlns:pic="http://schemas.openxmlformats.org/drawingml/2006/picture">
+                  <pic:nvPicPr>
+                    <pic:cNvPr id="1492476383" name="Image 1492476383"/>
+                    <pic:cNvPicPr/>
+                  </pic:nvPicPr>
+                  <pic:blipFill>
+                    <a:blip r:embed="rId21">
+                      <a:extLst>
+                        <a:ext uri="{28A0092B-C50C-407E-A947-70E740481C1C}">
+                          <a14:useLocalDpi xmlns:a14="http://schemas.microsoft.com/office/drawing/2010/main" val="0"/>
+                        </a:ext>
+                      </a:extLst>
+                    </a:blip>
+                    <a:stretch>
+                      <a:fillRect/>
+                    </a:stretch>
+                  </pic:blipFill>
+                  <pic:spPr>
+                    <a:xfrm>
+                      <a:off x="0" y="0"/>
+                      <a:ext cx="5759450" cy="7504430"/>
+                    </a:xfrm>
+                    <a:prstGeom prst="rect">
+                      <a:avLst/>
+                    </a:prstGeom>
+                    <a:ln>
+                      <a:solidFill>
+                        <a:schemeClr val="accent1">
+                          <a:lumMod val="40000"/>
+                          <a:lumOff val="60000"/>
+                        </a:schemeClr>
+                      </a:solidFill>
+                    </a:ln>
+                  </pic:spPr>
+                </pic:pic>
+              </a:graphicData>
+            </a:graphic>
+          </wp:inline>
+        </w:drawing>
+      </w:r>
+    </w:p>
     <w:sectPr>
       <w:headerReference w:type="default" r:id="rId22"/>
       <w:footerReference w:type="default" r:id="rId23"/>
@@ -17307,6 +17646,92 @@
     </w:lvl>
   </w:abstractNum>
   <w:abstractNum w:abstractNumId="1" w15:restartNumberingAfterBreak="0">
+    <w:nsid w:val="04915F96"/>
+    <w:multiLevelType w:val="hybridMultilevel"/>
+    <w:tmpl w:val="6DE08CA0"/>
+    <w:lvl w:ilvl="0" w:tplc="20000017">
+      <w:start w:val="1"/>
+      <w:numFmt w:val="lowerLetter"/>
+      <w:lvlText w:val="%1)"/>
+      <w:lvlJc w:val="left"/>
+      <w:pPr>
+        <w:ind w:left="1490" w:hanging="360"/>
+      </w:pPr>
+    </w:lvl>
+    <w:lvl w:ilvl="1" w:tplc="20000019" w:tentative="1">
+      <w:start w:val="1"/>
+      <w:numFmt w:val="lowerLetter"/>
+      <w:lvlText w:val="%2."/>
+      <w:lvlJc w:val="left"/>
+      <w:pPr>
+        <w:ind w:left="2210" w:hanging="360"/>
+      </w:pPr>
+    </w:lvl>
+    <w:lvl w:ilvl="2" w:tplc="2000001B" w:tentative="1">
+      <w:start w:val="1"/>
+      <w:numFmt w:val="lowerRoman"/>
+      <w:lvlText w:val="%3."/>
+      <w:lvlJc w:val="right"/>
+      <w:pPr>
+        <w:ind w:left="2930" w:hanging="180"/>
+      </w:pPr>
+    </w:lvl>
+    <w:lvl w:ilvl="3" w:tplc="2000000F" w:tentative="1">
+      <w:start w:val="1"/>
+      <w:numFmt w:val="decimal"/>
+      <w:lvlText w:val="%4."/>
+      <w:lvlJc w:val="left"/>
+      <w:pPr>
+        <w:ind w:left="3650" w:hanging="360"/>
+      </w:pPr>
+    </w:lvl>
+    <w:lvl w:ilvl="4" w:tplc="20000019" w:tentative="1">
+      <w:start w:val="1"/>
+      <w:numFmt w:val="lowerLetter"/>
+      <w:lvlText w:val="%5."/>
+      <w:lvlJc w:val="left"/>
+      <w:pPr>
+        <w:ind w:left="4370" w:hanging="360"/>
+      </w:pPr>
+    </w:lvl>
+    <w:lvl w:ilvl="5" w:tplc="2000001B" w:tentative="1">
+      <w:start w:val="1"/>
+      <w:numFmt w:val="lowerRoman"/>
+      <w:lvlText w:val="%6."/>
+      <w:lvlJc w:val="right"/>
+      <w:pPr>
+        <w:ind w:left="5090" w:hanging="180"/>
+      </w:pPr>
+    </w:lvl>
+    <w:lvl w:ilvl="6" w:tplc="2000000F" w:tentative="1">
+      <w:start w:val="1"/>
+      <w:numFmt w:val="decimal"/>
+      <w:lvlText w:val="%7."/>
+      <w:lvlJc w:val="left"/>
+      <w:pPr>
+        <w:ind w:left="5810" w:hanging="360"/>
+      </w:pPr>
+    </w:lvl>
+    <w:lvl w:ilvl="7" w:tplc="20000019" w:tentative="1">
+      <w:start w:val="1"/>
+      <w:numFmt w:val="lowerLetter"/>
+      <w:lvlText w:val="%8."/>
+      <w:lvlJc w:val="left"/>
+      <w:pPr>
+        <w:ind w:left="6530" w:hanging="360"/>
+      </w:pPr>
+    </w:lvl>
+    <w:lvl w:ilvl="8" w:tplc="2000001B" w:tentative="1">
+      <w:start w:val="1"/>
+      <w:numFmt w:val="lowerRoman"/>
+      <w:lvlText w:val="%9."/>
+      <w:lvlJc w:val="right"/>
+      <w:pPr>
+        <w:ind w:left="7250" w:hanging="180"/>
+      </w:pPr>
+    </w:lvl>
+  </w:abstractNum>
+  <w:abstractNum w:abstractNumId="2" w15:restartNumberingAfterBreak="0">
     <w:nsid w:val="04CA58A0"/>
     <w:multiLevelType w:val="hybridMultilevel"/>
     <w:tmpl w:val="5622EE42"/>
@@ -17396,7 +17821,7 @@
       </w:pPr>
     </w:lvl>
   </w:abstractNum>
-  <w:abstractNum w:abstractNumId="2" w15:restartNumberingAfterBreak="0">
+  <w:abstractNum w:abstractNumId="3" w15:restartNumberingAfterBreak="0">
     <w:nsid w:val="05D97D4B"/>
     <w:multiLevelType w:val="hybridMultilevel"/>
     <w:tmpl w:val="FC82BA9C"/>
@@ -17509,7 +17934,7 @@
       </w:rPr>
     </w:lvl>
   </w:abstractNum>
-  <w:abstractNum w:abstractNumId="3" w15:restartNumberingAfterBreak="0">
+  <w:abstractNum w:abstractNumId="4" w15:restartNumberingAfterBreak="0">
     <w:nsid w:val="06702521"/>
     <w:multiLevelType w:val="hybridMultilevel"/>
     <w:tmpl w:val="59407E82"/>
@@ -17622,7 +18047,7 @@
       </w:rPr>
     </w:lvl>
   </w:abstractNum>
-  <w:abstractNum w:abstractNumId="4" w15:restartNumberingAfterBreak="0">
+  <w:abstractNum w:abstractNumId="5" w15:restartNumberingAfterBreak="0">
     <w:nsid w:val="08984D78"/>
     <w:multiLevelType w:val="multilevel"/>
     <w:tmpl w:val="58CCE4F4"/>
@@ -17735,7 +18160,7 @@
       </w:rPr>
     </w:lvl>
   </w:abstractNum>
-  <w:abstractNum w:abstractNumId="5" w15:restartNumberingAfterBreak="0">
+  <w:abstractNum w:abstractNumId="6" w15:restartNumberingAfterBreak="0">
     <w:nsid w:val="0B433ABF"/>
     <w:multiLevelType w:val="hybridMultilevel"/>
     <w:tmpl w:val="BE3698E4"/>
@@ -17856,7 +18281,7 @@
       </w:rPr>
     </w:lvl>
   </w:abstractNum>
-  <w:abstractNum w:abstractNumId="6" w15:restartNumberingAfterBreak="0">
+  <w:abstractNum w:abstractNumId="7" w15:restartNumberingAfterBreak="0">
     <w:nsid w:val="0BEC1CF0"/>
     <w:multiLevelType w:val="hybridMultilevel"/>
     <w:tmpl w:val="69044A18"/>
@@ -17969,7 +18394,7 @@
       </w:rPr>
     </w:lvl>
   </w:abstractNum>
-  <w:abstractNum w:abstractNumId="7" w15:restartNumberingAfterBreak="0">
+  <w:abstractNum w:abstractNumId="8" w15:restartNumberingAfterBreak="0">
     <w:nsid w:val="0C8C120A"/>
     <w:multiLevelType w:val="hybridMultilevel"/>
     <w:tmpl w:val="7292DC40"/>
@@ -18066,7 +18491,7 @@
       </w:pPr>
     </w:lvl>
   </w:abstractNum>
-  <w:abstractNum w:abstractNumId="8" w15:restartNumberingAfterBreak="0">
+  <w:abstractNum w:abstractNumId="9" w15:restartNumberingAfterBreak="0">
     <w:nsid w:val="0E417BB3"/>
     <w:multiLevelType w:val="hybridMultilevel"/>
     <w:tmpl w:val="BBFAFF58"/>
@@ -18179,7 +18604,7 @@
       </w:rPr>
     </w:lvl>
   </w:abstractNum>
-  <w:abstractNum w:abstractNumId="9" w15:restartNumberingAfterBreak="0">
+  <w:abstractNum w:abstractNumId="10" w15:restartNumberingAfterBreak="0">
     <w:nsid w:val="0EC976C0"/>
     <w:multiLevelType w:val="hybridMultilevel"/>
     <w:tmpl w:val="A7329950"/>
@@ -18301,7 +18726,7 @@
       </w:rPr>
     </w:lvl>
   </w:abstractNum>
-  <w:abstractNum w:abstractNumId="10" w15:restartNumberingAfterBreak="0">
+  <w:abstractNum w:abstractNumId="11" w15:restartNumberingAfterBreak="0">
     <w:nsid w:val="10AE208F"/>
     <w:multiLevelType w:val="hybridMultilevel"/>
     <w:tmpl w:val="81DC518C"/>
@@ -18399,7 +18824,7 @@
       </w:pPr>
     </w:lvl>
   </w:abstractNum>
-  <w:abstractNum w:abstractNumId="11" w15:restartNumberingAfterBreak="0">
+  <w:abstractNum w:abstractNumId="12" w15:restartNumberingAfterBreak="0">
     <w:nsid w:val="10FB2CB9"/>
     <w:multiLevelType w:val="hybridMultilevel"/>
     <w:tmpl w:val="F518514E"/>
@@ -18512,7 +18937,7 @@
       </w:rPr>
     </w:lvl>
   </w:abstractNum>
-  <w:abstractNum w:abstractNumId="12" w15:restartNumberingAfterBreak="0">
+  <w:abstractNum w:abstractNumId="13" w15:restartNumberingAfterBreak="0">
     <w:nsid w:val="11866DA3"/>
     <w:multiLevelType w:val="hybridMultilevel"/>
     <w:tmpl w:val="75F0DC74"/>
@@ -18634,7 +19059,7 @@
       </w:rPr>
     </w:lvl>
   </w:abstractNum>
-  <w:abstractNum w:abstractNumId="13" w15:restartNumberingAfterBreak="0">
+  <w:abstractNum w:abstractNumId="14" w15:restartNumberingAfterBreak="0">
     <w:nsid w:val="11AB7695"/>
     <w:multiLevelType w:val="hybridMultilevel"/>
     <w:tmpl w:val="01D6AEFC"/>
@@ -18756,7 +19181,7 @@
       </w:rPr>
     </w:lvl>
   </w:abstractNum>
-  <w:abstractNum w:abstractNumId="14" w15:restartNumberingAfterBreak="0">
+  <w:abstractNum w:abstractNumId="15" w15:restartNumberingAfterBreak="0">
     <w:nsid w:val="12E75ED0"/>
     <w:multiLevelType w:val="hybridMultilevel"/>
     <w:tmpl w:val="6D5039A2"/>
@@ -18845,7 +19270,7 @@
       </w:pPr>
     </w:lvl>
   </w:abstractNum>
-  <w:abstractNum w:abstractNumId="15" w15:restartNumberingAfterBreak="0">
+  <w:abstractNum w:abstractNumId="16" w15:restartNumberingAfterBreak="0">
     <w:nsid w:val="170E2761"/>
     <w:multiLevelType w:val="hybridMultilevel"/>
     <w:tmpl w:val="8BA26E38"/>
@@ -18966,7 +19391,7 @@
       </w:rPr>
     </w:lvl>
   </w:abstractNum>
-  <w:abstractNum w:abstractNumId="16" w15:restartNumberingAfterBreak="0">
+  <w:abstractNum w:abstractNumId="17" w15:restartNumberingAfterBreak="0">
     <w:nsid w:val="1F466839"/>
     <w:multiLevelType w:val="hybridMultilevel"/>
     <w:tmpl w:val="2B26CA02"/>
@@ -19087,7 +19512,93 @@
       </w:rPr>
     </w:lvl>
   </w:abstractNum>
-  <w:abstractNum w:abstractNumId="17" w15:restartNumberingAfterBreak="0">
+  <w:abstractNum w:abstractNumId="18" w15:restartNumberingAfterBreak="0">
+    <w:nsid w:val="250F7A67"/>
+    <w:multiLevelType w:val="hybridMultilevel"/>
+    <w:tmpl w:val="200CCB14"/>
+    <w:lvl w:ilvl="0" w:tplc="20000017">
+      <w:start w:val="1"/>
+      <w:numFmt w:val="lowerLetter"/>
+      <w:lvlText w:val="%1)"/>
+      <w:lvlJc w:val="left"/>
+      <w:pPr>
+        <w:ind w:left="1739" w:hanging="360"/>
+      </w:pPr>
+    </w:lvl>
+    <w:lvl w:ilvl="1" w:tplc="20000019" w:tentative="1">
+      <w:start w:val="1"/>
+      <w:numFmt w:val="lowerLetter"/>
+      <w:lvlText w:val="%2."/>
+      <w:lvlJc w:val="left"/>
+      <w:pPr>
+        <w:ind w:left="2459" w:hanging="360"/>
+      </w:pPr>
+    </w:lvl>
+    <w:lvl w:ilvl="2" w:tplc="2000001B" w:tentative="1">
+      <w:start w:val="1"/>
+      <w:numFmt w:val="lowerRoman"/>
+      <w:lvlText w:val="%3."/>
+      <w:lvlJc w:val="right"/>
+      <w:pPr>
+        <w:ind w:left="3179" w:hanging="180"/>
+      </w:pPr>
+    </w:lvl>
+    <w:lvl w:ilvl="3" w:tplc="2000000F" w:tentative="1">
+      <w:start w:val="1"/>
+      <w:numFmt w:val="decimal"/>
+      <w:lvlText w:val="%4."/>
+      <w:lvlJc w:val="left"/>
+      <w:pPr>
+        <w:ind w:left="3899" w:hanging="360"/>
+      </w:pPr>
+    </w:lvl>
+    <w:lvl w:ilvl="4" w:tplc="20000019" w:tentative="1">
+      <w:start w:val="1"/>
+      <w:numFmt w:val="lowerLetter"/>
+      <w:lvlText w:val="%5."/>
+      <w:lvlJc w:val="left"/>
+      <w:pPr>
+        <w:ind w:left="4619" w:hanging="360"/>
+      </w:pPr>
+    </w:lvl>
+    <w:lvl w:ilvl="5" w:tplc="2000001B" w:tentative="1">
+      <w:start w:val="1"/>
+      <w:numFmt w:val="lowerRoman"/>
+      <w:lvlText w:val="%6."/>
+      <w:lvlJc w:val="right"/>
+      <w:pPr>
+        <w:ind w:left="5339" w:hanging="180"/>
+      </w:pPr>
+    </w:lvl>
+    <w:lvl w:ilvl="6" w:tplc="2000000F" w:tentative="1">
+      <w:start w:val="1"/>
+      <w:numFmt w:val="decimal"/>
+      <w:lvlText w:val="%7."/>
+      <w:lvlJc w:val="left"/>
+      <w:pPr>
+        <w:ind w:left="6059" w:hanging="360"/>
+      </w:pPr>
+    </w:lvl>
+    <w:lvl w:ilvl="7" w:tplc="20000019" w:tentative="1">
+      <w:start w:val="1"/>
+      <w:numFmt w:val="lowerLetter"/>
+      <w:lvlText w:val="%8."/>
+      <w:lvlJc w:val="left"/>
+      <w:pPr>
+        <w:ind w:left="6779" w:hanging="360"/>
+      </w:pPr>
+    </w:lvl>
+    <w:lvl w:ilvl="8" w:tplc="2000001B" w:tentative="1">
+      <w:start w:val="1"/>
+      <w:numFmt w:val="lowerRoman"/>
+      <w:lvlText w:val="%9."/>
+      <w:lvlJc w:val="right"/>
+      <w:pPr>
+        <w:ind w:left="7499" w:hanging="180"/>
+      </w:pPr>
+    </w:lvl>
+  </w:abstractNum>
+  <w:abstractNum w:abstractNumId="19" w15:restartNumberingAfterBreak="0">
     <w:nsid w:val="2AF37704"/>
     <w:multiLevelType w:val="hybridMultilevel"/>
     <w:tmpl w:val="B980D33A"/>
@@ -19209,7 +19720,7 @@
       </w:rPr>
     </w:lvl>
   </w:abstractNum>
-  <w:abstractNum w:abstractNumId="18" w15:restartNumberingAfterBreak="0">
+  <w:abstractNum w:abstractNumId="20" w15:restartNumberingAfterBreak="0">
     <w:nsid w:val="2B3B27A6"/>
     <w:multiLevelType w:val="hybridMultilevel"/>
     <w:tmpl w:val="609CDB2C"/>
@@ -19295,7 +19806,7 @@
       </w:pPr>
     </w:lvl>
   </w:abstractNum>
-  <w:abstractNum w:abstractNumId="19" w15:restartNumberingAfterBreak="0">
+  <w:abstractNum w:abstractNumId="21" w15:restartNumberingAfterBreak="0">
     <w:nsid w:val="2C2A7FEC"/>
     <w:multiLevelType w:val="hybridMultilevel"/>
     <w:tmpl w:val="22545D4A"/>
@@ -19417,7 +19928,7 @@
       </w:rPr>
     </w:lvl>
   </w:abstractNum>
-  <w:abstractNum w:abstractNumId="20" w15:restartNumberingAfterBreak="0">
+  <w:abstractNum w:abstractNumId="22" w15:restartNumberingAfterBreak="0">
     <w:nsid w:val="2E565151"/>
     <w:multiLevelType w:val="hybridMultilevel"/>
     <w:tmpl w:val="5A38925C"/>
@@ -19539,7 +20050,7 @@
       </w:rPr>
     </w:lvl>
   </w:abstractNum>
-  <w:abstractNum w:abstractNumId="21" w15:restartNumberingAfterBreak="0">
+  <w:abstractNum w:abstractNumId="23" w15:restartNumberingAfterBreak="0">
     <w:nsid w:val="358A1E35"/>
     <w:multiLevelType w:val="hybridMultilevel"/>
     <w:tmpl w:val="C7164D4E"/>
@@ -19660,7 +20171,7 @@
       </w:rPr>
     </w:lvl>
   </w:abstractNum>
-  <w:abstractNum w:abstractNumId="22" w15:restartNumberingAfterBreak="0">
+  <w:abstractNum w:abstractNumId="24" w15:restartNumberingAfterBreak="0">
     <w:nsid w:val="46FF79DC"/>
     <w:multiLevelType w:val="hybridMultilevel"/>
     <w:tmpl w:val="538A26EA"/>
@@ -19757,7 +20268,7 @@
       </w:pPr>
     </w:lvl>
   </w:abstractNum>
-  <w:abstractNum w:abstractNumId="23" w15:restartNumberingAfterBreak="0">
+  <w:abstractNum w:abstractNumId="25" w15:restartNumberingAfterBreak="0">
     <w:nsid w:val="484822ED"/>
     <w:multiLevelType w:val="multilevel"/>
     <w:tmpl w:val="AD007626"/>
@@ -19870,7 +20381,7 @@
       </w:rPr>
     </w:lvl>
   </w:abstractNum>
-  <w:abstractNum w:abstractNumId="24" w15:restartNumberingAfterBreak="0">
+  <w:abstractNum w:abstractNumId="26" w15:restartNumberingAfterBreak="0">
     <w:nsid w:val="517C4A61"/>
     <w:multiLevelType w:val="hybridMultilevel"/>
     <w:tmpl w:val="3862727E"/>
@@ -19992,7 +20503,7 @@
       </w:rPr>
     </w:lvl>
   </w:abstractNum>
-  <w:abstractNum w:abstractNumId="25" w15:restartNumberingAfterBreak="0">
+  <w:abstractNum w:abstractNumId="27" w15:restartNumberingAfterBreak="0">
     <w:nsid w:val="519059C8"/>
     <w:multiLevelType w:val="multilevel"/>
     <w:tmpl w:val="58CCE4F4"/>
@@ -20105,7 +20616,7 @@
       </w:rPr>
     </w:lvl>
   </w:abstractNum>
-  <w:abstractNum w:abstractNumId="26" w15:restartNumberingAfterBreak="0">
+  <w:abstractNum w:abstractNumId="28" w15:restartNumberingAfterBreak="0">
     <w:nsid w:val="5509013A"/>
     <w:multiLevelType w:val="hybridMultilevel"/>
     <w:tmpl w:val="1D62B69C"/>
@@ -20191,7 +20702,7 @@
       </w:pPr>
     </w:lvl>
   </w:abstractNum>
-  <w:abstractNum w:abstractNumId="27" w15:restartNumberingAfterBreak="0">
+  <w:abstractNum w:abstractNumId="29" w15:restartNumberingAfterBreak="0">
     <w:nsid w:val="581D0D4B"/>
     <w:multiLevelType w:val="hybridMultilevel"/>
     <w:tmpl w:val="DF2AEB4C"/>
@@ -20312,7 +20823,7 @@
       </w:rPr>
     </w:lvl>
   </w:abstractNum>
-  <w:abstractNum w:abstractNumId="28" w15:restartNumberingAfterBreak="0">
+  <w:abstractNum w:abstractNumId="30" w15:restartNumberingAfterBreak="0">
     <w:nsid w:val="5AAE052A"/>
     <w:multiLevelType w:val="hybridMultilevel"/>
     <w:tmpl w:val="B2BA011A"/>
@@ -20402,7 +20913,7 @@
       </w:pPr>
     </w:lvl>
   </w:abstractNum>
-  <w:abstractNum w:abstractNumId="29" w15:restartNumberingAfterBreak="0">
+  <w:abstractNum w:abstractNumId="31" w15:restartNumberingAfterBreak="0">
     <w:nsid w:val="5BDE2776"/>
     <w:multiLevelType w:val="hybridMultilevel"/>
     <w:tmpl w:val="596AA54E"/>
@@ -20515,7 +21026,7 @@
       </w:rPr>
     </w:lvl>
   </w:abstractNum>
-  <w:abstractNum w:abstractNumId="30" w15:restartNumberingAfterBreak="0">
+  <w:abstractNum w:abstractNumId="32" w15:restartNumberingAfterBreak="0">
     <w:nsid w:val="5C9A526E"/>
     <w:multiLevelType w:val="multilevel"/>
     <w:tmpl w:val="62B4F4F2"/>
@@ -20664,7 +21175,7 @@
       </w:rPr>
     </w:lvl>
   </w:abstractNum>
-  <w:abstractNum w:abstractNumId="31" w15:restartNumberingAfterBreak="0">
+  <w:abstractNum w:abstractNumId="33" w15:restartNumberingAfterBreak="0">
     <w:nsid w:val="67310C0D"/>
     <w:multiLevelType w:val="hybridMultilevel"/>
     <w:tmpl w:val="54163FB0"/>
@@ -20761,7 +21272,7 @@
       </w:pPr>
     </w:lvl>
   </w:abstractNum>
-  <w:abstractNum w:abstractNumId="32" w15:restartNumberingAfterBreak="0">
+  <w:abstractNum w:abstractNumId="34" w15:restartNumberingAfterBreak="0">
     <w:nsid w:val="67556E02"/>
     <w:multiLevelType w:val="hybridMultilevel"/>
     <w:tmpl w:val="0C28B358"/>
@@ -20883,7 +21394,7 @@
       </w:rPr>
     </w:lvl>
   </w:abstractNum>
-  <w:abstractNum w:abstractNumId="33" w15:restartNumberingAfterBreak="0">
+  <w:abstractNum w:abstractNumId="35" w15:restartNumberingAfterBreak="0">
     <w:nsid w:val="68943583"/>
     <w:multiLevelType w:val="multilevel"/>
     <w:tmpl w:val="4858D2F6"/>
@@ -21028,7 +21539,7 @@
       </w:rPr>
     </w:lvl>
   </w:abstractNum>
-  <w:abstractNum w:abstractNumId="34" w15:restartNumberingAfterBreak="0">
+  <w:abstractNum w:abstractNumId="36" w15:restartNumberingAfterBreak="0">
     <w:nsid w:val="6A133080"/>
     <w:multiLevelType w:val="hybridMultilevel"/>
     <w:tmpl w:val="9E84C746"/>
@@ -21114,7 +21625,7 @@
       </w:pPr>
     </w:lvl>
   </w:abstractNum>
-  <w:abstractNum w:abstractNumId="35" w15:restartNumberingAfterBreak="0">
+  <w:abstractNum w:abstractNumId="37" w15:restartNumberingAfterBreak="0">
     <w:nsid w:val="6C640687"/>
     <w:multiLevelType w:val="hybridMultilevel"/>
     <w:tmpl w:val="01D6AEFC"/>
@@ -21236,7 +21747,93 @@
       </w:rPr>
     </w:lvl>
   </w:abstractNum>
-  <w:abstractNum w:abstractNumId="36" w15:restartNumberingAfterBreak="0">
+  <w:abstractNum w:abstractNumId="38" w15:restartNumberingAfterBreak="0">
+    <w:nsid w:val="6DD2507A"/>
+    <w:multiLevelType w:val="hybridMultilevel"/>
+    <w:tmpl w:val="46BC1EBA"/>
+    <w:lvl w:ilvl="0" w:tplc="20000017">
+      <w:start w:val="1"/>
+      <w:numFmt w:val="lowerLetter"/>
+      <w:lvlText w:val="%1)"/>
+      <w:lvlJc w:val="left"/>
+      <w:pPr>
+        <w:ind w:left="720" w:hanging="360"/>
+      </w:pPr>
+    </w:lvl>
+    <w:lvl w:ilvl="1" w:tplc="20000019" w:tentative="1">
+      <w:start w:val="1"/>
+      <w:numFmt w:val="lowerLetter"/>
+      <w:lvlText w:val="%2."/>
+      <w:lvlJc w:val="left"/>
+      <w:pPr>
+        <w:ind w:left="1440" w:hanging="360"/>
+      </w:pPr>
+    </w:lvl>
+    <w:lvl w:ilvl="2" w:tplc="2000001B" w:tentative="1">
+      <w:start w:val="1"/>
+      <w:numFmt w:val="lowerRoman"/>
+      <w:lvlText w:val="%3."/>
+      <w:lvlJc w:val="right"/>
+      <w:pPr>
+        <w:ind w:left="2160" w:hanging="180"/>
+      </w:pPr>
+    </w:lvl>
+    <w:lvl w:ilvl="3" w:tplc="2000000F" w:tentative="1">
+      <w:start w:val="1"/>
+      <w:numFmt w:val="decimal"/>
+      <w:lvlText w:val="%4."/>
+      <w:lvlJc w:val="left"/>
+      <w:pPr>
+        <w:ind w:left="2880" w:hanging="360"/>
+      </w:pPr>
+    </w:lvl>
+    <w:lvl w:ilvl="4" w:tplc="20000019" w:tentative="1">
+      <w:start w:val="1"/>
+      <w:numFmt w:val="lowerLetter"/>
+      <w:lvlText w:val="%5."/>
+      <w:lvlJc w:val="left"/>
+      <w:pPr>
+        <w:ind w:left="3600" w:hanging="360"/>
+      </w:pPr>
+    </w:lvl>
+    <w:lvl w:ilvl="5" w:tplc="2000001B" w:tentative="1">
+      <w:start w:val="1"/>
+      <w:numFmt w:val="lowerRoman"/>
+      <w:lvlText w:val="%6."/>
+      <w:lvlJc w:val="right"/>
+      <w:pPr>
+        <w:ind w:left="4320" w:hanging="180"/>
+      </w:pPr>
+    </w:lvl>
+    <w:lvl w:ilvl="6" w:tplc="2000000F" w:tentative="1">
+      <w:start w:val="1"/>
+      <w:numFmt w:val="decimal"/>
+      <w:lvlText w:val="%7."/>
+      <w:lvlJc w:val="left"/>
+      <w:pPr>
+        <w:ind w:left="5040" w:hanging="360"/>
+      </w:pPr>
+    </w:lvl>
+    <w:lvl w:ilvl="7" w:tplc="20000019" w:tentative="1">
+      <w:start w:val="1"/>
+      <w:numFmt w:val="lowerLetter"/>
+      <w:lvlText w:val="%8."/>
+      <w:lvlJc w:val="left"/>
+      <w:pPr>
+        <w:ind w:left="5760" w:hanging="360"/>
+      </w:pPr>
+    </w:lvl>
+    <w:lvl w:ilvl="8" w:tplc="2000001B" w:tentative="1">
+      <w:start w:val="1"/>
+      <w:numFmt w:val="lowerRoman"/>
+      <w:lvlText w:val="%9."/>
+      <w:lvlJc w:val="right"/>
+      <w:pPr>
+        <w:ind w:left="6480" w:hanging="180"/>
+      </w:pPr>
+    </w:lvl>
+  </w:abstractNum>
+  <w:abstractNum w:abstractNumId="39" w15:restartNumberingAfterBreak="0">
     <w:nsid w:val="6EF903BF"/>
     <w:multiLevelType w:val="multilevel"/>
     <w:tmpl w:val="297847B0"/>
@@ -21385,7 +21982,7 @@
       </w:rPr>
     </w:lvl>
   </w:abstractNum>
-  <w:abstractNum w:abstractNumId="37" w15:restartNumberingAfterBreak="0">
+  <w:abstractNum w:abstractNumId="40" w15:restartNumberingAfterBreak="0">
     <w:nsid w:val="77DE558F"/>
     <w:multiLevelType w:val="hybridMultilevel"/>
     <w:tmpl w:val="88CEC7B0"/>
@@ -21507,7 +22104,7 @@
       </w:rPr>
     </w:lvl>
   </w:abstractNum>
-  <w:abstractNum w:abstractNumId="38" w15:restartNumberingAfterBreak="0">
+  <w:abstractNum w:abstractNumId="41" w15:restartNumberingAfterBreak="0">
     <w:nsid w:val="78DB4CEF"/>
     <w:multiLevelType w:val="hybridMultilevel"/>
     <w:tmpl w:val="0F4AFAF2"/>
@@ -21604,7 +22201,7 @@
       </w:pPr>
     </w:lvl>
   </w:abstractNum>
-  <w:abstractNum w:abstractNumId="39" w15:restartNumberingAfterBreak="0">
+  <w:abstractNum w:abstractNumId="42" w15:restartNumberingAfterBreak="0">
     <w:nsid w:val="7D016007"/>
     <w:multiLevelType w:val="hybridMultilevel"/>
     <w:tmpl w:val="3DD452A2"/>
@@ -21718,124 +22315,133 @@
     </w:lvl>
   </w:abstractNum>
   <w:num w:numId="1" w16cid:durableId="2012179846">
+    <w:abstractNumId w:val="5"/>
+  </w:num>
+  <w:num w:numId="2" w16cid:durableId="1365207183">
+    <w:abstractNumId w:val="15"/>
+  </w:num>
+  <w:num w:numId="3" w16cid:durableId="318316185">
+    <w:abstractNumId w:val="3"/>
+  </w:num>
+  <w:num w:numId="4" w16cid:durableId="1770009563">
+    <w:abstractNumId w:val="39"/>
+  </w:num>
+  <w:num w:numId="5" w16cid:durableId="2058579802">
+    <w:abstractNumId w:val="32"/>
+  </w:num>
+  <w:num w:numId="6" w16cid:durableId="737165875">
+    <w:abstractNumId w:val="42"/>
+  </w:num>
+  <w:num w:numId="7" w16cid:durableId="163209347">
+    <w:abstractNumId w:val="27"/>
+  </w:num>
+  <w:num w:numId="8" w16cid:durableId="1528644575">
+    <w:abstractNumId w:val="9"/>
+  </w:num>
+  <w:num w:numId="9" w16cid:durableId="833376966">
+    <w:abstractNumId w:val="25"/>
+  </w:num>
+  <w:num w:numId="10" w16cid:durableId="1261793150">
+    <w:abstractNumId w:val="2"/>
+  </w:num>
+  <w:num w:numId="11" w16cid:durableId="1646734366">
+    <w:abstractNumId w:val="7"/>
+  </w:num>
+  <w:num w:numId="12" w16cid:durableId="290282183">
+    <w:abstractNumId w:val="35"/>
+  </w:num>
+  <w:num w:numId="13" w16cid:durableId="508524748">
     <w:abstractNumId w:val="4"/>
   </w:num>
-  <w:num w:numId="2" w16cid:durableId="1365207183">
-    <w:abstractNumId w:val="14"/>
+  <w:num w:numId="14" w16cid:durableId="1998417116">
+    <w:abstractNumId w:val="12"/>
   </w:num>
-  <w:num w:numId="3" w16cid:durableId="318316185">
-    <w:abstractNumId w:val="2"/>
+  <w:num w:numId="15" w16cid:durableId="1707877043">
+    <w:abstractNumId w:val="30"/>
   </w:num>
-  <w:num w:numId="4" w16cid:durableId="1770009563">
+  <w:num w:numId="16" w16cid:durableId="602804732">
+    <w:abstractNumId w:val="31"/>
+  </w:num>
+  <w:num w:numId="17" w16cid:durableId="1667323583">
+    <w:abstractNumId w:val="20"/>
+  </w:num>
+  <w:num w:numId="18" w16cid:durableId="1339581994">
+    <w:abstractNumId w:val="16"/>
+  </w:num>
+  <w:num w:numId="19" w16cid:durableId="796945160">
+    <w:abstractNumId w:val="17"/>
+  </w:num>
+  <w:num w:numId="20" w16cid:durableId="1704986089">
     <w:abstractNumId w:val="36"/>
   </w:num>
-  <w:num w:numId="5" w16cid:durableId="2058579802">
-    <w:abstractNumId w:val="30"/>
-  </w:num>
-  <w:num w:numId="6" w16cid:durableId="737165875">
-    <w:abstractNumId w:val="39"/>
-  </w:num>
-  <w:num w:numId="7" w16cid:durableId="163209347">
-    <w:abstractNumId w:val="25"/>
-  </w:num>
-  <w:num w:numId="8" w16cid:durableId="1528644575">
+  <w:num w:numId="21" w16cid:durableId="737825128">
     <w:abstractNumId w:val="8"/>
   </w:num>
-  <w:num w:numId="9" w16cid:durableId="833376966">
-    <w:abstractNumId w:val="23"/>
+  <w:num w:numId="22" w16cid:durableId="478307426">
+    <w:abstractNumId w:val="34"/>
   </w:num>
-  <w:num w:numId="10" w16cid:durableId="1261793150">
-    <w:abstractNumId w:val="1"/>
+  <w:num w:numId="23" w16cid:durableId="1075933549">
+    <w:abstractNumId w:val="41"/>
   </w:num>
-  <w:num w:numId="11" w16cid:durableId="1646734366">
+  <w:num w:numId="24" w16cid:durableId="154339193">
+    <w:abstractNumId w:val="37"/>
+  </w:num>
+  <w:num w:numId="25" w16cid:durableId="1265847982">
+    <w:abstractNumId w:val="13"/>
+  </w:num>
+  <w:num w:numId="26" w16cid:durableId="55662880">
+    <w:abstractNumId w:val="29"/>
+  </w:num>
+  <w:num w:numId="27" w16cid:durableId="1258907346">
+    <w:abstractNumId w:val="11"/>
+  </w:num>
+  <w:num w:numId="28" w16cid:durableId="263659101">
+    <w:abstractNumId w:val="33"/>
+  </w:num>
+  <w:num w:numId="29" w16cid:durableId="353267007">
+    <w:abstractNumId w:val="40"/>
+  </w:num>
+  <w:num w:numId="30" w16cid:durableId="338392961">
+    <w:abstractNumId w:val="19"/>
+  </w:num>
+  <w:num w:numId="31" w16cid:durableId="1079987799">
+    <w:abstractNumId w:val="24"/>
+  </w:num>
+  <w:num w:numId="32" w16cid:durableId="765077720">
+    <w:abstractNumId w:val="26"/>
+  </w:num>
+  <w:num w:numId="33" w16cid:durableId="174809297">
     <w:abstractNumId w:val="6"/>
   </w:num>
-  <w:num w:numId="12" w16cid:durableId="290282183">
-    <w:abstractNumId w:val="33"/>
-  </w:num>
-  <w:num w:numId="13" w16cid:durableId="508524748">
-    <w:abstractNumId w:val="3"/>
-  </w:num>
-  <w:num w:numId="14" w16cid:durableId="1998417116">
-    <w:abstractNumId w:val="11"/>
-  </w:num>
-  <w:num w:numId="15" w16cid:durableId="1707877043">
+  <w:num w:numId="34" w16cid:durableId="834420448">
     <w:abstractNumId w:val="28"/>
   </w:num>
-  <w:num w:numId="16" w16cid:durableId="602804732">
-    <w:abstractNumId w:val="29"/>
-  </w:num>
-  <w:num w:numId="17" w16cid:durableId="1667323583">
-    <w:abstractNumId w:val="18"/>
-  </w:num>
-  <w:num w:numId="18" w16cid:durableId="1339581994">
-    <w:abstractNumId w:val="15"/>
-  </w:num>
-  <w:num w:numId="19" w16cid:durableId="796945160">
-    <w:abstractNumId w:val="16"/>
-  </w:num>
-  <w:num w:numId="20" w16cid:durableId="1704986089">
-    <w:abstractNumId w:val="34"/>
-  </w:num>
-  <w:num w:numId="21" w16cid:durableId="737825128">
-    <w:abstractNumId w:val="7"/>
-  </w:num>
-  <w:num w:numId="22" w16cid:durableId="478307426">
-    <w:abstractNumId w:val="32"/>
-  </w:num>
-  <w:num w:numId="23" w16cid:durableId="1075933549">
-    <w:abstractNumId w:val="38"/>
-  </w:num>
-  <w:num w:numId="24" w16cid:durableId="154339193">
-    <w:abstractNumId w:val="35"/>
-  </w:num>
-  <w:num w:numId="25" w16cid:durableId="1265847982">
-    <w:abstractNumId w:val="12"/>
-  </w:num>
-  <w:num w:numId="26" w16cid:durableId="55662880">
-    <w:abstractNumId w:val="27"/>
-  </w:num>
-  <w:num w:numId="27" w16cid:durableId="1258907346">
-    <w:abstractNumId w:val="10"/>
-  </w:num>
-  <w:num w:numId="28" w16cid:durableId="263659101">
-    <w:abstractNumId w:val="31"/>
-  </w:num>
-  <w:num w:numId="29" w16cid:durableId="353267007">
-    <w:abstractNumId w:val="37"/>
-  </w:num>
-  <w:num w:numId="30" w16cid:durableId="338392961">
-    <w:abstractNumId w:val="17"/>
-  </w:num>
-  <w:num w:numId="31" w16cid:durableId="1079987799">
-    <w:abstractNumId w:val="22"/>
-  </w:num>
-  <w:num w:numId="32" w16cid:durableId="765077720">
-    <w:abstractNumId w:val="24"/>
-  </w:num>
-  <w:num w:numId="33" w16cid:durableId="174809297">
-    <w:abstractNumId w:val="5"/>
-  </w:num>
-  <w:num w:numId="34" w16cid:durableId="834420448">
-    <w:abstractNumId w:val="26"/>
-  </w:num>
   <w:num w:numId="35" w16cid:durableId="1348368854">
-    <w:abstractNumId w:val="19"/>
+    <w:abstractNumId w:val="21"/>
   </w:num>
   <w:num w:numId="36" w16cid:durableId="1799756596">
-    <w:abstractNumId w:val="9"/>
+    <w:abstractNumId w:val="10"/>
   </w:num>
   <w:num w:numId="37" w16cid:durableId="1062486456">
     <w:abstractNumId w:val="0"/>
   </w:num>
   <w:num w:numId="38" w16cid:durableId="402262101">
-    <w:abstractNumId w:val="21"/>
+    <w:abstractNumId w:val="23"/>
   </w:num>
   <w:num w:numId="39" w16cid:durableId="2018538060">
-    <w:abstractNumId w:val="13"/>
+    <w:abstractNumId w:val="14"/>
   </w:num>
   <w:num w:numId="40" w16cid:durableId="1161508273">
-    <w:abstractNumId w:val="20"/>
+    <w:abstractNumId w:val="22"/>
+  </w:num>
+  <w:num w:numId="41" w16cid:durableId="663900281">
+    <w:abstractNumId w:val="38"/>
+  </w:num>
+  <w:num w:numId="42" w16cid:durableId="1851917979">
+    <w:abstractNumId w:val="18"/>
+  </w:num>
+  <w:num w:numId="43" w16cid:durableId="1028532539">
+    <w:abstractNumId w:val="1"/>
   </w:num>
   <w:numIdMacAtCleanup w:val="33"/>
 </w:numbering>

</xml_diff>